<commit_message>
Cite the journal version of Galyardt and Goldin instead of the arXiv preprint
</commit_message>
<xml_diff>
--- a/paper/closed-loop-genui.docx
+++ b/paper/closed-loop-genui.docx
@@ -23438,23 +23438,33 @@
           <w:color w:val="000000"/>
           <w:sz w:val="16"/>
         </w:rPr>
-        <w:t xml:space="preserve">“Predicting performance during tutoring with models of recent performance,”</w:t>
-      </w:r>
-      <w:r>
-        <w:rPr>
-          <w:rFonts w:ascii="Times New Roman" w:hAnsi="Times New Roman" w:cs="Times New Roman" w:eastAsia="Times New Roman"/>
-          <w:color w:val="000000"/>
-          <w:sz w:val="16"/>
-        </w:rPr>
-        <w:t xml:space="preserve"> </w:t>
-      </w:r>
-      <w:r>
-        <w:rPr>
-          <w:rFonts w:ascii="Times New Roman" w:hAnsi="Times New Roman" w:cs="Times New Roman" w:eastAsia="Times New Roman"/>
-          <w:color w:val="000000"/>
-          <w:sz w:val="16"/>
-        </w:rPr>
-        <w:t xml:space="preserve">arXiv:1501.02732, 2015. [Online]. Available:</w:t>
+        <w:t xml:space="preserve">“Move your lamp post: Recent data reflects learner knowledge better than older data,”</w:t>
+      </w:r>
+      <w:r>
+        <w:rPr>
+          <w:rFonts w:ascii="Times New Roman" w:hAnsi="Times New Roman" w:cs="Times New Roman" w:eastAsia="Times New Roman"/>
+          <w:color w:val="000000"/>
+          <w:sz w:val="16"/>
+        </w:rPr>
+        <w:t xml:space="preserve"> </w:t>
+      </w:r>
+      <w:r>
+        <w:rPr>
+          <w:rFonts w:ascii="Times New Roman" w:hAnsi="Times New Roman" w:cs="Times New Roman" w:eastAsia="Times New Roman"/>
+          <w:i/>
+          <w:iCs/>
+          <w:color w:val="000000"/>
+          <w:sz w:val="16"/>
+        </w:rPr>
+        <w:t xml:space="preserve">Journal of Educational Data Mining</w:t>
+      </w:r>
+      <w:r>
+        <w:rPr>
+          <w:rFonts w:ascii="Times New Roman" w:hAnsi="Times New Roman" w:cs="Times New Roman" w:eastAsia="Times New Roman"/>
+          <w:color w:val="000000"/>
+          <w:sz w:val="16"/>
+        </w:rPr>
+        <w:t xml:space="preserve">, vol. 7, no. 2, pp. 83–108, 2015. [Online]. Available:</w:t>
       </w:r>
       <w:r>
         <w:rPr>
@@ -23472,7 +23482,7 @@
             <w:color w:val="000000"/>
             <w:sz w:val="16"/>
           </w:rPr>
-          <w:t xml:space="preserve">https://arxiv.org/abs/1501.02732</w:t>
+          <w:t xml:space="preserve">https://doi.org/10.5281/zenodo.3554672</w:t>
         </w:r>
       </w:hyperlink>
     </w:p>

</xml_diff>

<commit_message>
Address review: results across 10 seeds, fallback guarantee, raw Gemini compliance, narrower novelty claim
</commit_message>
<xml_diff>
--- a/paper/closed-loop-genui.docx
+++ b/paper/closed-loop-genui.docx
@@ -459,7 +459,7 @@
           <w:color w:val="000000"/>
           <w:sz w:val="18"/>
         </w:rPr>
-        <w:t xml:space="preserve">planner (not full learner sessions), 98.7% of screens were within budget, against 92% when the model</w:t>
+        <w:t xml:space="preserve">planner (not full learner sessions), 98.7% of raw outputs were within budget before any fallback, against 92% when the model</w:t>
       </w:r>
       <w:r>
         <w:rPr>
@@ -874,21 +874,35 @@
           <w:rFonts w:ascii="Times New Roman" w:hAnsi="Times New Roman" w:cs="Times New Roman" w:eastAsia="Times New Roman"/>
           <w:color w:val="000000"/>
         </w:rPr>
-        <w:t xml:space="preserve">established; our contribution is their integration, in which a learner model</w:t>
-      </w:r>
-      <w:r>
-        <w:rPr>
-          <w:rFonts w:ascii="Times New Roman" w:hAnsi="Times New Roman" w:cs="Times New Roman" w:eastAsia="Times New Roman"/>
-          <w:color w:val="000000"/>
-        </w:rPr>
-        <w:t xml:space="preserve"> </w:t>
-      </w:r>
-      <w:r>
-        <w:rPr>
-          <w:rFonts w:ascii="Times New Roman" w:hAnsi="Times New Roman" w:cs="Times New Roman" w:eastAsia="Times New Roman"/>
-          <w:color w:val="000000"/>
-        </w:rPr>
-        <w:t xml:space="preserve">sets a structural budget that a generated interface must meet at runtime:</w:t>
+        <w:t xml:space="preserve">established; our contribution is their integration: to our knowledge, the first</w:t>
+      </w:r>
+      <w:r>
+        <w:rPr>
+          <w:rFonts w:ascii="Times New Roman" w:hAnsi="Times New Roman" w:cs="Times New Roman" w:eastAsia="Times New Roman"/>
+          <w:color w:val="000000"/>
+        </w:rPr>
+        <w:t xml:space="preserve"> </w:t>
+      </w:r>
+      <w:r>
+        <w:rPr>
+          <w:rFonts w:ascii="Times New Roman" w:hAnsi="Times New Roman" w:cs="Times New Roman" w:eastAsia="Times New Roman"/>
+          <w:color w:val="000000"/>
+        </w:rPr>
+        <w:t xml:space="preserve">system in which a BKT mastery estimate, through feedback control, sets a</w:t>
+      </w:r>
+      <w:r>
+        <w:rPr>
+          <w:rFonts w:ascii="Times New Roman" w:hAnsi="Times New Roman" w:cs="Times New Roman" w:eastAsia="Times New Roman"/>
+          <w:color w:val="000000"/>
+        </w:rPr>
+        <w:t xml:space="preserve"> </w:t>
+      </w:r>
+      <w:r>
+        <w:rPr>
+          <w:rFonts w:ascii="Times New Roman" w:hAnsi="Times New Roman" w:cs="Times New Roman" w:eastAsia="Times New Roman"/>
+          <w:color w:val="000000"/>
+        </w:rPr>
+        <w:t xml:space="preserve">structural budget that a runtime-generated interface must meet:</w:t>
       </w:r>
     </w:p>
     <w:p>
@@ -1245,21 +1259,35 @@
           <w:rFonts w:ascii="Times New Roman" w:hAnsi="Times New Roman" w:cs="Times New Roman" w:eastAsia="Times New Roman"/>
           <w:color w:val="000000"/>
         </w:rPr>
-        <w:t xml:space="preserve">systems bounds the generated interface by a learner model</w:t>
-      </w:r>
-      <w:r>
-        <w:rPr>
-          <w:rFonts w:ascii="Times New Roman" w:hAnsi="Times New Roman" w:cs="Times New Roman" w:eastAsia="Times New Roman"/>
-          <w:color w:val="000000"/>
-        </w:rPr>
-        <w:t xml:space="preserve"> </w:t>
-      </w:r>
-      <w:r>
-        <w:rPr>
-          <w:rFonts w:ascii="Times New Roman" w:hAnsi="Times New Roman" w:cs="Times New Roman" w:eastAsia="Times New Roman"/>
-          <w:color w:val="000000"/>
-        </w:rPr>
-        <w:t xml:space="preserve">(Table I).</w:t>
+        <w:t xml:space="preserve">systems bounds the generated interface by a learner model: SUPPLE models devices and</w:t>
+      </w:r>
+      <w:r>
+        <w:rPr>
+          <w:rFonts w:ascii="Times New Roman" w:hAnsi="Times New Roman" w:cs="Times New Roman" w:eastAsia="Times New Roman"/>
+          <w:color w:val="000000"/>
+        </w:rPr>
+        <w:t xml:space="preserve"> </w:t>
+      </w:r>
+      <w:r>
+        <w:rPr>
+          <w:rFonts w:ascii="Times New Roman" w:hAnsi="Times New Roman" w:cs="Times New Roman" w:eastAsia="Times New Roman"/>
+          <w:color w:val="000000"/>
+        </w:rPr>
+        <w:t xml:space="preserve">motor abilities, not knowledge; fading and staircase rules</w:t>
+      </w:r>
+      <w:r>
+        <w:rPr>
+          <w:rFonts w:ascii="Times New Roman" w:hAnsi="Times New Roman" w:cs="Times New Roman" w:eastAsia="Times New Roman"/>
+          <w:color w:val="000000"/>
+        </w:rPr>
+        <w:t xml:space="preserve"> </w:t>
+      </w:r>
+      <w:r>
+        <w:rPr>
+          <w:rFonts w:ascii="Times New Roman" w:hAnsi="Times New Roman" w:cs="Times New Roman" w:eastAsia="Times New Roman"/>
+          <w:color w:val="000000"/>
+        </w:rPr>
+        <w:t xml:space="preserve">[8], [17] adjust task difficulty, not interface structure (Table I).</w:t>
       </w:r>
     </w:p>
     <w:p>
@@ -1311,10 +1339,10 @@
         <w:tblLook w:firstRow="1" w:lastRow="0" w:firstColumn="0" w:lastColumn="0" w:noHBand="0" w:noVBand="0" w:val="0020"/>
       </w:tblPr>
       <w:tblGrid>
-        <w:gridCol w:w="1475"/>
-        <w:gridCol w:w="921"/>
-        <w:gridCol w:w="1167"/>
-        <w:gridCol w:w="1475"/>
+        <w:gridCol w:w="1950"/>
+        <w:gridCol w:w="975"/>
+        <w:gridCol w:w="975"/>
+        <w:gridCol w:w="1138"/>
       </w:tblGrid>
       <w:tr>
         <w:trPr>
@@ -1323,7 +1351,7 @@
         </w:trPr>
         <w:tc>
           <w:tcPr>
-            <w:tcW w:w="1475" w:type="dxa"/>
+            <w:tcW w:w="1950" w:type="dxa"/>
             <w:tcBorders>
               <w:bottom w:val="single" w:sz="4" w:space="0" w:color="000000"/>
             </w:tcBorders>
@@ -1352,7 +1380,7 @@
         </w:tc>
         <w:tc>
           <w:tcPr>
-            <w:tcW w:w="921" w:type="dxa"/>
+            <w:tcW w:w="975" w:type="dxa"/>
             <w:tcBorders>
               <w:bottom w:val="single" w:sz="4" w:space="0" w:color="000000"/>
             </w:tcBorders>
@@ -1381,7 +1409,7 @@
         </w:tc>
         <w:tc>
           <w:tcPr>
-            <w:tcW w:w="1167" w:type="dxa"/>
+            <w:tcW w:w="975" w:type="dxa"/>
             <w:tcBorders>
               <w:bottom w:val="single" w:sz="4" w:space="0" w:color="000000"/>
             </w:tcBorders>
@@ -1410,7 +1438,7 @@
         </w:tc>
         <w:tc>
           <w:tcPr>
-            <w:tcW w:w="1475" w:type="dxa"/>
+            <w:tcW w:w="1138" w:type="dxa"/>
             <w:tcBorders>
               <w:bottom w:val="single" w:sz="4" w:space="0" w:color="000000"/>
             </w:tcBorders>
@@ -1444,7 +1472,7 @@
         </w:trPr>
         <w:tc>
           <w:tcPr>
-            <w:tcW w:w="1475" w:type="dxa"/>
+            <w:tcW w:w="1950" w:type="dxa"/>
             <w:tcMar>
               <w:left w:w="60" w:type="dxa"/>
               <w:right w:w="60" w:type="dxa"/>
@@ -1470,7 +1498,7 @@
         </w:tc>
         <w:tc>
           <w:tcPr>
-            <w:tcW w:w="921" w:type="dxa"/>
+            <w:tcW w:w="975" w:type="dxa"/>
             <w:tcMar>
               <w:left w:w="60" w:type="dxa"/>
               <w:right w:w="60" w:type="dxa"/>
@@ -1496,7 +1524,7 @@
         </w:tc>
         <w:tc>
           <w:tcPr>
-            <w:tcW w:w="1167" w:type="dxa"/>
+            <w:tcW w:w="975" w:type="dxa"/>
             <w:tcMar>
               <w:left w:w="60" w:type="dxa"/>
               <w:right w:w="60" w:type="dxa"/>
@@ -1522,7 +1550,7 @@
         </w:tc>
         <w:tc>
           <w:tcPr>
-            <w:tcW w:w="1475" w:type="dxa"/>
+            <w:tcW w:w="1138" w:type="dxa"/>
             <w:tcMar>
               <w:left w:w="60" w:type="dxa"/>
               <w:right w:w="60" w:type="dxa"/>
@@ -1553,7 +1581,7 @@
         </w:trPr>
         <w:tc>
           <w:tcPr>
-            <w:tcW w:w="1475" w:type="dxa"/>
+            <w:tcW w:w="1950" w:type="dxa"/>
             <w:tcMar>
               <w:left w:w="60" w:type="dxa"/>
               <w:right w:w="60" w:type="dxa"/>
@@ -1579,7 +1607,7 @@
         </w:tc>
         <w:tc>
           <w:tcPr>
-            <w:tcW w:w="921" w:type="dxa"/>
+            <w:tcW w:w="975" w:type="dxa"/>
             <w:tcMar>
               <w:left w:w="60" w:type="dxa"/>
               <w:right w:w="60" w:type="dxa"/>
@@ -1605,7 +1633,7 @@
         </w:tc>
         <w:tc>
           <w:tcPr>
-            <w:tcW w:w="1167" w:type="dxa"/>
+            <w:tcW w:w="975" w:type="dxa"/>
             <w:tcMar>
               <w:left w:w="60" w:type="dxa"/>
               <w:right w:w="60" w:type="dxa"/>
@@ -1631,7 +1659,7 @@
         </w:tc>
         <w:tc>
           <w:tcPr>
-            <w:tcW w:w="1475" w:type="dxa"/>
+            <w:tcW w:w="1138" w:type="dxa"/>
             <w:tcMar>
               <w:left w:w="60" w:type="dxa"/>
               <w:right w:w="60" w:type="dxa"/>
@@ -1662,7 +1690,7 @@
         </w:trPr>
         <w:tc>
           <w:tcPr>
-            <w:tcW w:w="1475" w:type="dxa"/>
+            <w:tcW w:w="1950" w:type="dxa"/>
             <w:tcMar>
               <w:left w:w="60" w:type="dxa"/>
               <w:right w:w="60" w:type="dxa"/>
@@ -1688,7 +1716,7 @@
         </w:tc>
         <w:tc>
           <w:tcPr>
-            <w:tcW w:w="921" w:type="dxa"/>
+            <w:tcW w:w="975" w:type="dxa"/>
             <w:tcMar>
               <w:left w:w="60" w:type="dxa"/>
               <w:right w:w="60" w:type="dxa"/>
@@ -1714,7 +1742,7 @@
         </w:tc>
         <w:tc>
           <w:tcPr>
-            <w:tcW w:w="1167" w:type="dxa"/>
+            <w:tcW w:w="975" w:type="dxa"/>
             <w:tcMar>
               <w:left w:w="60" w:type="dxa"/>
               <w:right w:w="60" w:type="dxa"/>
@@ -1740,7 +1768,7 @@
         </w:tc>
         <w:tc>
           <w:tcPr>
-            <w:tcW w:w="1475" w:type="dxa"/>
+            <w:tcW w:w="1138" w:type="dxa"/>
             <w:tcMar>
               <w:left w:w="60" w:type="dxa"/>
               <w:right w:w="60" w:type="dxa"/>
@@ -1771,7 +1799,7 @@
         </w:trPr>
         <w:tc>
           <w:tcPr>
-            <w:tcW w:w="1475" w:type="dxa"/>
+            <w:tcW w:w="1950" w:type="dxa"/>
             <w:tcMar>
               <w:left w:w="60" w:type="dxa"/>
               <w:right w:w="60" w:type="dxa"/>
@@ -1797,7 +1825,7 @@
         </w:tc>
         <w:tc>
           <w:tcPr>
-            <w:tcW w:w="921" w:type="dxa"/>
+            <w:tcW w:w="975" w:type="dxa"/>
             <w:tcMar>
               <w:left w:w="60" w:type="dxa"/>
               <w:right w:w="60" w:type="dxa"/>
@@ -1823,7 +1851,7 @@
         </w:tc>
         <w:tc>
           <w:tcPr>
-            <w:tcW w:w="1167" w:type="dxa"/>
+            <w:tcW w:w="975" w:type="dxa"/>
             <w:tcMar>
               <w:left w:w="60" w:type="dxa"/>
               <w:right w:w="60" w:type="dxa"/>
@@ -1849,7 +1877,7 @@
         </w:tc>
         <w:tc>
           <w:tcPr>
-            <w:tcW w:w="1475" w:type="dxa"/>
+            <w:tcW w:w="1138" w:type="dxa"/>
             <w:tcMar>
               <w:left w:w="60" w:type="dxa"/>
               <w:right w:w="60" w:type="dxa"/>
@@ -1880,7 +1908,7 @@
         </w:trPr>
         <w:tc>
           <w:tcPr>
-            <w:tcW w:w="1475" w:type="dxa"/>
+            <w:tcW w:w="1950" w:type="dxa"/>
             <w:tcMar>
               <w:left w:w="60" w:type="dxa"/>
               <w:right w:w="60" w:type="dxa"/>
@@ -1905,7 +1933,7 @@
         </w:tc>
         <w:tc>
           <w:tcPr>
-            <w:tcW w:w="921" w:type="dxa"/>
+            <w:tcW w:w="975" w:type="dxa"/>
             <w:tcMar>
               <w:left w:w="60" w:type="dxa"/>
               <w:right w:w="60" w:type="dxa"/>
@@ -1930,7 +1958,7 @@
         </w:tc>
         <w:tc>
           <w:tcPr>
-            <w:tcW w:w="1167" w:type="dxa"/>
+            <w:tcW w:w="975" w:type="dxa"/>
             <w:tcMar>
               <w:left w:w="60" w:type="dxa"/>
               <w:right w:w="60" w:type="dxa"/>
@@ -1955,7 +1983,7 @@
         </w:tc>
         <w:tc>
           <w:tcPr>
-            <w:tcW w:w="1475" w:type="dxa"/>
+            <w:tcW w:w="1138" w:type="dxa"/>
             <w:tcMar>
               <w:left w:w="60" w:type="dxa"/>
               <w:right w:w="60" w:type="dxa"/>
@@ -2005,35 +2033,35 @@
           <w:rFonts w:ascii="Times New Roman" w:hAnsi="Times New Roman" w:cs="Times New Roman" w:eastAsia="Times New Roman"/>
           <w:color w:val="000000"/>
         </w:rPr>
-        <w:t xml:space="preserve">Cognitive load theory [17]</w:t>
-      </w:r>
-      <w:r>
-        <w:rPr>
-          <w:rFonts w:ascii="Times New Roman" w:hAnsi="Times New Roman" w:cs="Times New Roman" w:eastAsia="Times New Roman"/>
-          <w:color w:val="000000"/>
-        </w:rPr>
-        <w:t xml:space="preserve"> </w:t>
-      </w:r>
-      <w:r>
-        <w:rPr>
-          <w:rFonts w:ascii="Times New Roman" w:hAnsi="Times New Roman" w:cs="Times New Roman" w:eastAsia="Times New Roman"/>
-          <w:color w:val="000000"/>
-        </w:rPr>
-        <w:t xml:space="preserve">attributes intrinsic load to element interactivity [18].</w:t>
-      </w:r>
-      <w:r>
-        <w:rPr>
-          <w:rFonts w:ascii="Times New Roman" w:hAnsi="Times New Roman" w:cs="Times New Roman" w:eastAsia="Times New Roman"/>
-          <w:color w:val="000000"/>
-        </w:rPr>
-        <w:t xml:space="preserve"> </w:t>
-      </w:r>
-      <w:r>
-        <w:rPr>
-          <w:rFonts w:ascii="Times New Roman" w:hAnsi="Times New Roman" w:cs="Times New Roman" w:eastAsia="Times New Roman"/>
-          <w:color w:val="000000"/>
-        </w:rPr>
-        <w:t xml:space="preserve">Worked examples help algebra novices [19] and should fade</w:t>
+        <w:t xml:space="preserve">Cognitive load theory [18]</w:t>
+      </w:r>
+      <w:r>
+        <w:rPr>
+          <w:rFonts w:ascii="Times New Roman" w:hAnsi="Times New Roman" w:cs="Times New Roman" w:eastAsia="Times New Roman"/>
+          <w:color w:val="000000"/>
+        </w:rPr>
+        <w:t xml:space="preserve"> </w:t>
+      </w:r>
+      <w:r>
+        <w:rPr>
+          <w:rFonts w:ascii="Times New Roman" w:hAnsi="Times New Roman" w:cs="Times New Roman" w:eastAsia="Times New Roman"/>
+          <w:color w:val="000000"/>
+        </w:rPr>
+        <w:t xml:space="preserve">attributes intrinsic load to element interactivity [19].</w:t>
+      </w:r>
+      <w:r>
+        <w:rPr>
+          <w:rFonts w:ascii="Times New Roman" w:hAnsi="Times New Roman" w:cs="Times New Roman" w:eastAsia="Times New Roman"/>
+          <w:color w:val="000000"/>
+        </w:rPr>
+        <w:t xml:space="preserve"> </w:t>
+      </w:r>
+      <w:r>
+        <w:rPr>
+          <w:rFonts w:ascii="Times New Roman" w:hAnsi="Times New Roman" w:cs="Times New Roman" w:eastAsia="Times New Roman"/>
+          <w:color w:val="000000"/>
+        </w:rPr>
+        <w:t xml:space="preserve">Worked examples help algebra novices [20] and should fade</w:t>
       </w:r>
       <w:r>
         <w:rPr>
@@ -2075,21 +2103,21 @@
           <w:rFonts w:ascii="Times New Roman" w:hAnsi="Times New Roman" w:cs="Times New Roman" w:eastAsia="Times New Roman"/>
           <w:color w:val="000000"/>
         </w:rPr>
-        <w:t xml:space="preserve">[20]. The balance model aids early understanding of</w:t>
-      </w:r>
-      <w:r>
-        <w:rPr>
-          <w:rFonts w:ascii="Times New Roman" w:hAnsi="Times New Roman" w:cs="Times New Roman" w:eastAsia="Times New Roman"/>
-          <w:color w:val="000000"/>
-        </w:rPr>
-        <w:t xml:space="preserve"> </w:t>
-      </w:r>
-      <w:r>
-        <w:rPr>
-          <w:rFonts w:ascii="Times New Roman" w:hAnsi="Times New Roman" w:cs="Times New Roman" w:eastAsia="Times New Roman"/>
-          <w:color w:val="000000"/>
-        </w:rPr>
-        <w:t xml:space="preserve">linear equations but fails with negative quantities [21],</w:t>
+        <w:t xml:space="preserve">[21]. The balance model aids early understanding of</w:t>
+      </w:r>
+      <w:r>
+        <w:rPr>
+          <w:rFonts w:ascii="Times New Roman" w:hAnsi="Times New Roman" w:cs="Times New Roman" w:eastAsia="Times New Roman"/>
+          <w:color w:val="000000"/>
+        </w:rPr>
+        <w:t xml:space="preserve"> </w:t>
+      </w:r>
+      <w:r>
+        <w:rPr>
+          <w:rFonts w:ascii="Times New Roman" w:hAnsi="Times New Roman" w:cs="Times New Roman" w:eastAsia="Times New Roman"/>
+          <w:color w:val="000000"/>
+        </w:rPr>
+        <w:t xml:space="preserve">linear equations but fails with negative quantities [22],</w:t>
       </w:r>
       <w:r>
         <w:rPr>
@@ -2117,7 +2145,7 @@
           <w:rFonts w:ascii="Times New Roman" w:hAnsi="Times New Roman" w:cs="Times New Roman" w:eastAsia="Times New Roman"/>
           <w:color w:val="000000"/>
         </w:rPr>
-        <w:t xml:space="preserve">[22], [23].</w:t>
+        <w:t xml:space="preserve">[23], [24].</w:t>
       </w:r>
     </w:p>
     <w:p>
@@ -2159,7 +2187,7 @@
           <w:rFonts w:ascii="Times New Roman" w:hAnsi="Times New Roman" w:cs="Times New Roman" w:eastAsia="Times New Roman"/>
           <w:color w:val="000000"/>
         </w:rPr>
-        <w:t xml:space="preserve">[24], [25]. Constrained</w:t>
+        <w:t xml:space="preserve">[25], [26]. Constrained</w:t>
       </w:r>
       <w:r>
         <w:rPr>
@@ -2187,21 +2215,21 @@
           <w:rFonts w:ascii="Times New Roman" w:hAnsi="Times New Roman" w:cs="Times New Roman" w:eastAsia="Times New Roman"/>
           <w:color w:val="000000"/>
         </w:rPr>
-        <w:t xml:space="preserve">[26], though schema-constrained output is not perfectly</w:t>
-      </w:r>
-      <w:r>
-        <w:rPr>
-          <w:rFonts w:ascii="Times New Roman" w:hAnsi="Times New Roman" w:cs="Times New Roman" w:eastAsia="Times New Roman"/>
-          <w:color w:val="000000"/>
-        </w:rPr>
-        <w:t xml:space="preserve"> </w:t>
-      </w:r>
-      <w:r>
-        <w:rPr>
-          <w:rFonts w:ascii="Times New Roman" w:hAnsi="Times New Roman" w:cs="Times New Roman" w:eastAsia="Times New Roman"/>
-          <w:color w:val="000000"/>
-        </w:rPr>
-        <w:t xml:space="preserve">reliable in practice [27].</w:t>
+        <w:t xml:space="preserve">[27], though schema-constrained output is not perfectly</w:t>
+      </w:r>
+      <w:r>
+        <w:rPr>
+          <w:rFonts w:ascii="Times New Roman" w:hAnsi="Times New Roman" w:cs="Times New Roman" w:eastAsia="Times New Roman"/>
+          <w:color w:val="000000"/>
+        </w:rPr>
+        <w:t xml:space="preserve"> </w:t>
+      </w:r>
+      <w:r>
+        <w:rPr>
+          <w:rFonts w:ascii="Times New Roman" w:hAnsi="Times New Roman" w:cs="Times New Roman" w:eastAsia="Times New Roman"/>
+          <w:color w:val="000000"/>
+        </w:rPr>
+        <w:t xml:space="preserve">reliable in practice [28].</w:t>
       </w:r>
     </w:p>
     <w:bookmarkEnd w:id="10"/>
@@ -3258,7 +3286,7 @@
                   <w:sz w:val="20"/>
                   <w:szCs w:val="20"/>
                 </w:rPr>
-                <m:t>5</m:t>
+                <m:t>1</m:t>
               </m:r>
               <m:r>
                 <m:rPr>
@@ -3582,7 +3610,7 @@
                   <w:sz w:val="20"/>
                   <w:szCs w:val="20"/>
                 </w:rPr>
-                <m:t>6</m:t>
+                <m:t>2</m:t>
               </m:r>
               <m:r>
                 <m:rPr>
@@ -3938,7 +3966,7 @@
                   <w:sz w:val="20"/>
                   <w:szCs w:val="20"/>
                 </w:rPr>
-                <m:t>7</m:t>
+                <m:t>3</m:t>
               </m:r>
               <m:r>
                 <m:rPr>
@@ -5064,7 +5092,7 @@
           <w:rFonts w:ascii="Times New Roman" w:hAnsi="Times New Roman" w:cs="Times New Roman" w:eastAsia="Times New Roman"/>
           <w:color w:val="000000"/>
         </w:rPr>
-        <w:t xml:space="preserve">[1], [28]. The tracking error is normalized</w:t>
+        <w:t xml:space="preserve">[1], [29]. The tracking error is normalized</w:t>
       </w:r>
       <w:r>
         <w:rPr>
@@ -5716,7 +5744,7 @@
               <w:sz w:val="20"/>
               <w:szCs w:val="20"/>
             </w:rPr>
-            <m:t>1</m:t>
+            <m:t>4</m:t>
           </m:r>
           <m:r>
             <m:rPr>
@@ -6102,7 +6130,7 @@
               <w:sz w:val="20"/>
               <w:szCs w:val="20"/>
             </w:rPr>
-            <m:t>2</m:t>
+            <m:t>5</m:t>
           </m:r>
           <m:r>
             <m:rPr>
@@ -6433,7 +6461,7 @@
           <w:rFonts w:ascii="Times New Roman" w:hAnsi="Times New Roman" w:cs="Times New Roman" w:eastAsia="Times New Roman"/>
           <w:color w:val="000000"/>
         </w:rPr>
-        <w:t xml:space="preserve">for anti-windup [25] and the first-order filtered derivative</w:t>
+        <w:t xml:space="preserve">for anti-windup [26] and the first-order filtered derivative</w:t>
       </w:r>
       <w:r>
         <w:rPr>
@@ -6694,7 +6722,7 @@
           <w:rFonts w:ascii="Times New Roman" w:hAnsi="Times New Roman" w:cs="Times New Roman" w:eastAsia="Times New Roman"/>
           <w:color w:val="000000"/>
         </w:rPr>
-        <w:t xml:space="preserve">[24]. An</w:t>
+        <w:t xml:space="preserve">[25]. An</w:t>
       </w:r>
       <w:r>
         <w:rPr>
@@ -6915,7 +6943,7 @@
               <w:sz w:val="20"/>
               <w:szCs w:val="20"/>
             </w:rPr>
-            <m:t>3</m:t>
+            <m:t>6</m:t>
           </m:r>
           <m:r>
             <m:rPr>
@@ -7477,7 +7505,7 @@
           <w:rFonts w:ascii="Times New Roman" w:hAnsi="Times New Roman" w:cs="Times New Roman" w:eastAsia="Times New Roman"/>
           <w:color w:val="000000"/>
         </w:rPr>
-        <w:t xml:space="preserve">Classical tuning rules [29], [30]</w:t>
+        <w:t xml:space="preserve">Classical tuning rules [30], [31]</w:t>
       </w:r>
       <w:r>
         <w:rPr>
@@ -7825,7 +7853,7 @@
           <w:rFonts w:ascii="Times New Roman" w:hAnsi="Times New Roman" w:cs="Times New Roman" w:eastAsia="Times New Roman"/>
           <w:color w:val="000000"/>
         </w:rPr>
-        <w:t xml:space="preserve">(Section IV) [31] on a separate 1,000-learner</w:t>
+        <w:t xml:space="preserve">(Section IV) [32] on a separate 1,000-learner</w:t>
       </w:r>
       <w:r>
         <w:rPr>
@@ -9486,7 +9514,7 @@
           <w:rFonts w:ascii="Times New Roman" w:hAnsi="Times New Roman" w:cs="Times New Roman" w:eastAsia="Times New Roman"/>
           <w:color w:val="000000"/>
         </w:rPr>
-        <w:t xml:space="preserve">[32], evaluated zero-shot, took 1.32 s per decision (median, CPU)</w:t>
+        <w:t xml:space="preserve">[33], evaluated zero-shot, took 1.32 s per decision (median, CPU)</w:t>
       </w:r>
       <w:r>
         <w:rPr>
@@ -9596,7 +9624,7 @@
           <w:rFonts w:ascii="Times New Roman" w:hAnsi="Times New Roman" w:cs="Times New Roman" w:eastAsia="Times New Roman"/>
           <w:color w:val="000000"/>
         </w:rPr>
-        <w:t xml:space="preserve">168 candidates) and picks the one whose</w:t>
+        <w:t xml:space="preserve">102 valid layouts) and picks the one whose</w:t>
       </w:r>
       <w:r>
         <w:rPr>
@@ -10068,7 +10096,52 @@
           <w:rFonts w:ascii="Times New Roman" w:hAnsi="Times New Roman" w:cs="Times New Roman" w:eastAsia="Times New Roman"/>
           <w:color w:val="000000"/>
         </w:rPr>
-        <w:t xml:space="preserve">tree nearest to the budget is rendered instead. A web client renders the</w:t>
+        <w:t xml:space="preserve">tree is rendered instead: the planner’s layout for the nearest of 41 budgets</w:t>
+      </w:r>
+      <w:r>
+        <w:rPr>
+          <w:rFonts w:ascii="Times New Roman" w:hAnsi="Times New Roman" w:cs="Times New Roman" w:eastAsia="Times New Roman"/>
+          <w:color w:val="000000"/>
+        </w:rPr>
+        <w:t xml:space="preserve"> </w:t>
+      </w:r>
+      <w:r>
+        <w:rPr>
+          <w:rFonts w:ascii="Times New Roman" w:hAnsi="Times New Roman" w:cs="Times New Roman" w:eastAsia="Times New Roman"/>
+          <w:color w:val="000000"/>
+        </w:rPr>
+        <w:t xml:space="preserve">1/40 apart, within</w:t>
+      </w:r>
+      <w:r>
+        <w:rPr>
+          <w:rFonts w:ascii="Times New Roman" w:hAnsi="Times New Roman" w:cs="Times New Roman" w:eastAsia="Times New Roman"/>
+          <w:color w:val="000000"/>
+        </w:rPr>
+        <w:t xml:space="preserve"> </w:t>
+      </w:r>
+      <m:oMath>
+        <m:r>
+          <w:rPr>
+            <w:rFonts w:ascii="Cambria Math" w:hAnsi="Cambria Math"/>
+            <w:sz w:val="20"/>
+            <w:szCs w:val="20"/>
+          </w:rPr>
+          <m:t>ε</m:t>
+        </m:r>
+      </m:oMath>
+      <w:r>
+        <w:rPr>
+          <w:rFonts w:ascii="Times New Roman" w:hAnsi="Times New Roman" w:cs="Times New Roman" w:eastAsia="Times New Roman"/>
+          <w:color w:val="000000"/>
+        </w:rPr>
+        <w:t xml:space="preserve"> </w:t>
+      </w:r>
+      <w:r>
+        <w:rPr>
+          <w:rFonts w:ascii="Times New Roman" w:hAnsi="Times New Roman" w:cs="Times New Roman" w:eastAsia="Times New Roman"/>
+          <w:color w:val="000000"/>
+        </w:rPr>
+        <w:t xml:space="preserve">for every budget and policy decision (worst 0.049). A web client renders the</w:t>
       </w:r>
       <w:r>
         <w:rPr>
@@ -10930,7 +11003,7 @@
               <w:sz w:val="20"/>
               <w:szCs w:val="20"/>
             </w:rPr>
-            <m:t>4</m:t>
+            <m:t>7</m:t>
           </m:r>
           <m:r>
             <m:rPr>
@@ -11163,21 +11236,21 @@
           <w:rFonts w:ascii="Times New Roman" w:hAnsi="Times New Roman" w:cs="Times New Roman" w:eastAsia="Times New Roman"/>
           <w:color w:val="000000"/>
         </w:rPr>
-        <w:t xml:space="preserve">Each feature has a basis in prior work: element interactivity raises load [18]</w:t>
-      </w:r>
-      <w:r>
-        <w:rPr>
-          <w:rFonts w:ascii="Times New Roman" w:hAnsi="Times New Roman" w:cs="Times New Roman" w:eastAsia="Times New Roman"/>
-          <w:color w:val="000000"/>
-        </w:rPr>
-        <w:t xml:space="preserve"> </w:t>
-      </w:r>
-      <w:r>
-        <w:rPr>
-          <w:rFonts w:ascii="Times New Roman" w:hAnsi="Times New Roman" w:cs="Times New Roman" w:eastAsia="Times New Roman"/>
-          <w:color w:val="000000"/>
-        </w:rPr>
-        <w:t xml:space="preserve">and display density is a classic complexity measure [33];</w:t>
+        <w:t xml:space="preserve">Each feature has a basis in prior work: element interactivity raises load [19]</w:t>
+      </w:r>
+      <w:r>
+        <w:rPr>
+          <w:rFonts w:ascii="Times New Roman" w:hAnsi="Times New Roman" w:cs="Times New Roman" w:eastAsia="Times New Roman"/>
+          <w:color w:val="000000"/>
+        </w:rPr>
+        <w:t xml:space="preserve"> </w:t>
+      </w:r>
+      <w:r>
+        <w:rPr>
+          <w:rFonts w:ascii="Times New Roman" w:hAnsi="Times New Roman" w:cs="Times New Roman" w:eastAsia="Times New Roman"/>
+          <w:color w:val="000000"/>
+        </w:rPr>
+        <w:t xml:space="preserve">and display density is a classic complexity measure [34];</w:t>
       </w:r>
       <w:r>
         <w:rPr>
@@ -11205,21 +11278,21 @@
           <w:rFonts w:ascii="Times New Roman" w:hAnsi="Times New Roman" w:cs="Times New Roman" w:eastAsia="Times New Roman"/>
           <w:color w:val="000000"/>
         </w:rPr>
-        <w:t xml:space="preserve">workspace follows concreteness fading [20]; and</w:t>
-      </w:r>
-      <w:r>
-        <w:rPr>
-          <w:rFonts w:ascii="Times New Roman" w:hAnsi="Times New Roman" w:cs="Times New Roman" w:eastAsia="Times New Roman"/>
-          <w:color w:val="000000"/>
-        </w:rPr>
-        <w:t xml:space="preserve"> </w:t>
-      </w:r>
-      <w:r>
-        <w:rPr>
-          <w:rFonts w:ascii="Times New Roman" w:hAnsi="Times New Roman" w:cs="Times New Roman" w:eastAsia="Times New Roman"/>
-          <w:color w:val="000000"/>
-        </w:rPr>
-        <w:t xml:space="preserve">deeper structures cost users more [34].</w:t>
+        <w:t xml:space="preserve">workspace follows concreteness fading [21]; and</w:t>
+      </w:r>
+      <w:r>
+        <w:rPr>
+          <w:rFonts w:ascii="Times New Roman" w:hAnsi="Times New Roman" w:cs="Times New Roman" w:eastAsia="Times New Roman"/>
+          <w:color w:val="000000"/>
+        </w:rPr>
+        <w:t xml:space="preserve"> </w:t>
+      </w:r>
+      <w:r>
+        <w:rPr>
+          <w:rFonts w:ascii="Times New Roman" w:hAnsi="Times New Roman" w:cs="Times New Roman" w:eastAsia="Times New Roman"/>
+          <w:color w:val="000000"/>
+        </w:rPr>
+        <w:t xml:space="preserve">deeper structures cost users more [35].</w:t>
       </w:r>
       <w:r>
         <w:rPr>
@@ -11337,7 +11410,7 @@
           <w:rFonts w:ascii="Times New Roman" w:hAnsi="Times New Roman" w:cs="Times New Roman" w:eastAsia="Times New Roman"/>
           <w:color w:val="000000"/>
         </w:rPr>
-        <w:t xml:space="preserve">in that setting [35], and test sensitivity to the weights</w:t>
+        <w:t xml:space="preserve">in that setting [36], and test sensitivity to the weights</w:t>
       </w:r>
       <w:r>
         <w:rPr>
@@ -11472,7 +11545,7 @@
           <w:rFonts w:ascii="Times New Roman" w:hAnsi="Times New Roman" w:cs="Times New Roman" w:eastAsia="Times New Roman"/>
           <w:color w:val="000000"/>
         </w:rPr>
-        <w:t xml:space="preserve">before human studies [36], [37], and</w:t>
+        <w:t xml:space="preserve">before human studies [37], [38], and</w:t>
       </w:r>
       <w:r>
         <w:rPr>
@@ -11500,7 +11573,7 @@
           <w:rFonts w:ascii="Times New Roman" w:hAnsi="Times New Roman" w:cs="Times New Roman" w:eastAsia="Times New Roman"/>
           <w:color w:val="000000"/>
         </w:rPr>
-        <w:t xml:space="preserve">[38]. Each learner is a two-state</w:t>
+        <w:t xml:space="preserve">[39]. Each learner is a two-state</w:t>
       </w:r>
       <w:r>
         <w:rPr>
@@ -11654,7 +11727,7 @@
     <w:tbl>
       <w:tblPr>
         <w:tblStyle w:val="Table"/>
-        <w:tblW w:w="5036" w:type="dxa"/>
+        <w:tblW w:w="5037" w:type="dxa"/>
         <w:jc w:val="center"/>
         <w:tblBorders>
           <w:top w:val="single" w:sz="8" w:space="0" w:color="000000"/>
@@ -11664,11 +11737,11 @@
         <w:tblLook w:firstRow="1" w:lastRow="0" w:firstColumn="0" w:lastColumn="0" w:noHBand="0" w:noVBand="0" w:val="0020"/>
       </w:tblPr>
       <w:tblGrid>
-        <w:gridCol w:w="1419"/>
-        <w:gridCol w:w="1064"/>
-        <w:gridCol w:w="851"/>
-        <w:gridCol w:w="851"/>
-        <w:gridCol w:w="851"/>
+        <w:gridCol w:w="1866"/>
+        <w:gridCol w:w="933"/>
+        <w:gridCol w:w="746"/>
+        <w:gridCol w:w="746"/>
+        <w:gridCol w:w="746"/>
       </w:tblGrid>
       <w:tr>
         <w:trPr>
@@ -11677,7 +11750,7 @@
         </w:trPr>
         <w:tc>
           <w:tcPr>
-            <w:tcW w:w="1419" w:type="dxa"/>
+            <w:tcW w:w="1866" w:type="dxa"/>
             <w:tcBorders>
               <w:bottom w:val="single" w:sz="4" w:space="0" w:color="000000"/>
             </w:tcBorders>
@@ -11706,7 +11779,7 @@
         </w:tc>
         <w:tc>
           <w:tcPr>
-            <w:tcW w:w="1064" w:type="dxa"/>
+            <w:tcW w:w="933" w:type="dxa"/>
             <w:tcBorders>
               <w:bottom w:val="single" w:sz="4" w:space="0" w:color="000000"/>
             </w:tcBorders>
@@ -11781,7 +11854,7 @@
         </w:tc>
         <w:tc>
           <w:tcPr>
-            <w:tcW w:w="851" w:type="dxa"/>
+            <w:tcW w:w="746" w:type="dxa"/>
             <w:tcBorders>
               <w:bottom w:val="single" w:sz="4" w:space="0" w:color="000000"/>
             </w:tcBorders>
@@ -11842,7 +11915,7 @@
         </w:tc>
         <w:tc>
           <w:tcPr>
-            <w:tcW w:w="851" w:type="dxa"/>
+            <w:tcW w:w="746" w:type="dxa"/>
             <w:tcBorders>
               <w:bottom w:val="single" w:sz="4" w:space="0" w:color="000000"/>
             </w:tcBorders>
@@ -11903,7 +11976,7 @@
         </w:tc>
         <w:tc>
           <w:tcPr>
-            <w:tcW w:w="851" w:type="dxa"/>
+            <w:tcW w:w="746" w:type="dxa"/>
             <w:tcBorders>
               <w:bottom w:val="single" w:sz="4" w:space="0" w:color="000000"/>
             </w:tcBorders>
@@ -11969,7 +12042,7 @@
         </w:trPr>
         <w:tc>
           <w:tcPr>
-            <w:tcW w:w="1419" w:type="dxa"/>
+            <w:tcW w:w="1866" w:type="dxa"/>
             <w:tcMar>
               <w:left w:w="60" w:type="dxa"/>
               <w:right w:w="60" w:type="dxa"/>
@@ -11995,7 +12068,7 @@
         </w:tc>
         <w:tc>
           <w:tcPr>
-            <w:tcW w:w="1064" w:type="dxa"/>
+            <w:tcW w:w="933" w:type="dxa"/>
             <w:tcMar>
               <w:left w:w="60" w:type="dxa"/>
               <w:right w:w="60" w:type="dxa"/>
@@ -12021,7 +12094,7 @@
         </w:tc>
         <w:tc>
           <w:tcPr>
-            <w:tcW w:w="851" w:type="dxa"/>
+            <w:tcW w:w="746" w:type="dxa"/>
             <w:tcMar>
               <w:left w:w="60" w:type="dxa"/>
               <w:right w:w="60" w:type="dxa"/>
@@ -12047,7 +12120,7 @@
         </w:tc>
         <w:tc>
           <w:tcPr>
-            <w:tcW w:w="851" w:type="dxa"/>
+            <w:tcW w:w="746" w:type="dxa"/>
             <w:tcMar>
               <w:left w:w="60" w:type="dxa"/>
               <w:right w:w="60" w:type="dxa"/>
@@ -12073,7 +12146,7 @@
         </w:tc>
         <w:tc>
           <w:tcPr>
-            <w:tcW w:w="851" w:type="dxa"/>
+            <w:tcW w:w="746" w:type="dxa"/>
             <w:tcMar>
               <w:left w:w="60" w:type="dxa"/>
               <w:right w:w="60" w:type="dxa"/>
@@ -12104,7 +12177,7 @@
         </w:trPr>
         <w:tc>
           <w:tcPr>
-            <w:tcW w:w="1419" w:type="dxa"/>
+            <w:tcW w:w="1866" w:type="dxa"/>
             <w:tcMar>
               <w:left w:w="60" w:type="dxa"/>
               <w:right w:w="60" w:type="dxa"/>
@@ -12130,7 +12203,7 @@
         </w:tc>
         <w:tc>
           <w:tcPr>
-            <w:tcW w:w="1064" w:type="dxa"/>
+            <w:tcW w:w="933" w:type="dxa"/>
             <w:tcMar>
               <w:left w:w="60" w:type="dxa"/>
               <w:right w:w="60" w:type="dxa"/>
@@ -12156,7 +12229,7 @@
         </w:tc>
         <w:tc>
           <w:tcPr>
-            <w:tcW w:w="851" w:type="dxa"/>
+            <w:tcW w:w="746" w:type="dxa"/>
             <w:tcMar>
               <w:left w:w="60" w:type="dxa"/>
               <w:right w:w="60" w:type="dxa"/>
@@ -12182,7 +12255,7 @@
         </w:tc>
         <w:tc>
           <w:tcPr>
-            <w:tcW w:w="851" w:type="dxa"/>
+            <w:tcW w:w="746" w:type="dxa"/>
             <w:tcMar>
               <w:left w:w="60" w:type="dxa"/>
               <w:right w:w="60" w:type="dxa"/>
@@ -12208,7 +12281,7 @@
         </w:tc>
         <w:tc>
           <w:tcPr>
-            <w:tcW w:w="851" w:type="dxa"/>
+            <w:tcW w:w="746" w:type="dxa"/>
             <w:tcMar>
               <w:left w:w="60" w:type="dxa"/>
               <w:right w:w="60" w:type="dxa"/>
@@ -12239,7 +12312,7 @@
         </w:trPr>
         <w:tc>
           <w:tcPr>
-            <w:tcW w:w="1419" w:type="dxa"/>
+            <w:tcW w:w="1866" w:type="dxa"/>
             <w:tcMar>
               <w:left w:w="60" w:type="dxa"/>
               <w:right w:w="60" w:type="dxa"/>
@@ -12264,7 +12337,7 @@
         </w:tc>
         <w:tc>
           <w:tcPr>
-            <w:tcW w:w="1064" w:type="dxa"/>
+            <w:tcW w:w="933" w:type="dxa"/>
             <w:tcMar>
               <w:left w:w="60" w:type="dxa"/>
               <w:right w:w="60" w:type="dxa"/>
@@ -12289,7 +12362,7 @@
         </w:tc>
         <w:tc>
           <w:tcPr>
-            <w:tcW w:w="851" w:type="dxa"/>
+            <w:tcW w:w="746" w:type="dxa"/>
             <w:tcMar>
               <w:left w:w="60" w:type="dxa"/>
               <w:right w:w="60" w:type="dxa"/>
@@ -12314,7 +12387,7 @@
         </w:tc>
         <w:tc>
           <w:tcPr>
-            <w:tcW w:w="851" w:type="dxa"/>
+            <w:tcW w:w="746" w:type="dxa"/>
             <w:tcMar>
               <w:left w:w="60" w:type="dxa"/>
               <w:right w:w="60" w:type="dxa"/>
@@ -12339,7 +12412,7 @@
         </w:tc>
         <w:tc>
           <w:tcPr>
-            <w:tcW w:w="851" w:type="dxa"/>
+            <w:tcW w:w="746" w:type="dxa"/>
             <w:tcMar>
               <w:left w:w="60" w:type="dxa"/>
               <w:right w:w="60" w:type="dxa"/>
@@ -12564,7 +12637,7 @@
           <w:rFonts w:ascii="Times New Roman" w:hAnsi="Times New Roman" w:cs="Times New Roman" w:eastAsia="Times New Roman"/>
           <w:color w:val="000000"/>
         </w:rPr>
-        <w:t xml:space="preserve">spirit of [39]. Arms 1 and 3 render catalog trees. (4)</w:t>
+        <w:t xml:space="preserve">spirit of [17]. Arms 1 and 3 render catalog trees. (4)</w:t>
       </w:r>
       <w:r>
         <w:rPr>
@@ -13234,7 +13307,7 @@
                 <w:color w:val="000000"/>
                 <w:sz w:val="16"/>
               </w:rPr>
-              <w:t xml:space="preserve">Within budget, of all calls</w:t>
+              <w:t xml:space="preserve">Raw output within budget, of all calls</w:t>
             </w:r>
           </w:p>
         </w:tc>
@@ -13610,6 +13683,34 @@
         </w:rPr>
         <w:t xml:space="preserve">rate thus matches free mode, and its 15% drift rate is a stress setting.</w:t>
       </w:r>
+      <w:r>
+        <w:rPr>
+          <w:rFonts w:ascii="Times New Roman" w:hAnsi="Times New Roman" w:cs="Times New Roman" w:eastAsia="Times New Roman"/>
+          <w:color w:val="000000"/>
+        </w:rPr>
+        <w:t xml:space="preserve"> </w:t>
+      </w:r>
+      <w:r>
+        <w:rPr>
+          <w:rFonts w:ascii="Times New Roman" w:hAnsi="Times New Roman" w:cs="Times New Roman" w:eastAsia="Times New Roman"/>
+          <w:color w:val="000000"/>
+        </w:rPr>
+        <w:t xml:space="preserve">Compliance counts raw outputs over all calls; after the gate, every</w:t>
+      </w:r>
+      <w:r>
+        <w:rPr>
+          <w:rFonts w:ascii="Times New Roman" w:hAnsi="Times New Roman" w:cs="Times New Roman" w:eastAsia="Times New Roman"/>
+          <w:color w:val="000000"/>
+        </w:rPr>
+        <w:t xml:space="preserve"> </w:t>
+      </w:r>
+      <w:r>
+        <w:rPr>
+          <w:rFonts w:ascii="Times New Roman" w:hAnsi="Times New Roman" w:cs="Times New Roman" w:eastAsia="Times New Roman"/>
+          <w:color w:val="000000"/>
+        </w:rPr>
+        <w:t xml:space="preserve">rendered tree met the budget.</w:t>
+      </w:r>
     </w:p>
     <w:p>
       <w:pPr>
@@ -14589,7 +14690,7 @@
           <w:rFonts w:ascii="Times New Roman" w:hAnsi="Times New Roman" w:cs="Times New Roman" w:eastAsia="Times New Roman"/>
           <w:color w:val="000000"/>
         </w:rPr>
-        <w:t xml:space="preserve">[31], where</w:t>
+        <w:t xml:space="preserve">[32], where</w:t>
       </w:r>
       <w:r>
         <w:rPr>
@@ -14707,7 +14808,63 @@
           <w:rFonts w:ascii="Times New Roman" w:hAnsi="Times New Roman" w:cs="Times New Roman" w:eastAsia="Times New Roman"/>
           <w:color w:val="000000"/>
         </w:rPr>
-        <w:t xml:space="preserve">variation across learners in this run, not across independent runs.</w:t>
+        <w:t xml:space="preserve">variation across learners in this run. Over ten independent test seeds the</w:t>
+      </w:r>
+      <w:r>
+        <w:rPr>
+          <w:rFonts w:ascii="Times New Roman" w:hAnsi="Times New Roman" w:cs="Times New Roman" w:eastAsia="Times New Roman"/>
+          <w:color w:val="000000"/>
+        </w:rPr>
+        <w:t xml:space="preserve"> </w:t>
+      </w:r>
+      <w:r>
+        <w:rPr>
+          <w:rFonts w:ascii="Times New Roman" w:hAnsi="Times New Roman" w:cs="Times New Roman" w:eastAsia="Times New Roman"/>
+          <w:color w:val="000000"/>
+        </w:rPr>
+        <w:t xml:space="preserve">ranking of arms never changed and the closed loop’s</w:t>
+      </w:r>
+      <w:r>
+        <w:rPr>
+          <w:rFonts w:ascii="Times New Roman" w:hAnsi="Times New Roman" w:cs="Times New Roman" w:eastAsia="Times New Roman"/>
+          <w:color w:val="000000"/>
+        </w:rPr>
+        <w:t xml:space="preserve"> </w:t>
+      </w:r>
+      <m:oMath>
+        <m:r>
+          <m:rPr>
+            <m:sty m:val="p"/>
+          </m:rPr>
+          <w:rPr>
+            <w:rFonts w:ascii="Cambria Math" w:hAnsi="Cambria Math"/>
+            <w:sz w:val="20"/>
+            <w:szCs w:val="20"/>
+          </w:rPr>
+          <m:t>Δ</m:t>
+        </m:r>
+        <m:r>
+          <w:rPr>
+            <w:rFonts w:ascii="Cambria Math" w:hAnsi="Cambria Math"/>
+            <w:sz w:val="20"/>
+            <w:szCs w:val="20"/>
+          </w:rPr>
+          <m:t>M</m:t>
+        </m:r>
+      </m:oMath>
+      <w:r>
+        <w:rPr>
+          <w:rFonts w:ascii="Times New Roman" w:hAnsi="Times New Roman" w:cs="Times New Roman" w:eastAsia="Times New Roman"/>
+          <w:color w:val="000000"/>
+        </w:rPr>
+        <w:t xml:space="preserve"> </w:t>
+      </w:r>
+      <w:r>
+        <w:rPr>
+          <w:rFonts w:ascii="Times New Roman" w:hAnsi="Times New Roman" w:cs="Times New Roman" w:eastAsia="Times New Roman"/>
+          <w:color w:val="000000"/>
+        </w:rPr>
+        <w:t xml:space="preserve">stayed within 0.0118–0.0122.</w:t>
       </w:r>
     </w:p>
     <w:tbl>
@@ -14937,7 +15094,7 @@
           <w:tbl>
             <w:tblPr>
               <w:tblStyle w:val="Table"/>
-              <w:tblW w:w="10316" w:type="dxa"/>
+              <w:tblW w:w="10314" w:type="dxa"/>
               <w:jc w:val="center"/>
               <w:tblBorders>
                 <w:top w:val="single" w:sz="8" w:space="0" w:color="000000"/>
@@ -14947,15 +15104,15 @@
               <w:tblLook w:firstRow="1" w:lastRow="0" w:firstColumn="0" w:lastColumn="0" w:noHBand="0" w:noVBand="0" w:val="0020"/>
             </w:tblPr>
             <w:tblGrid>
-              <w:gridCol w:w="2084"/>
-              <w:gridCol w:w="2293"/>
-              <w:gridCol w:w="938"/>
-              <w:gridCol w:w="938"/>
-              <w:gridCol w:w="938"/>
-              <w:gridCol w:w="833"/>
-              <w:gridCol w:w="938"/>
-              <w:gridCol w:w="521"/>
-              <w:gridCol w:w="833"/>
+              <w:gridCol w:w="1826"/>
+              <w:gridCol w:w="2009"/>
+              <w:gridCol w:w="821"/>
+              <w:gridCol w:w="821"/>
+              <w:gridCol w:w="1095"/>
+              <w:gridCol w:w="1004"/>
+              <w:gridCol w:w="1095"/>
+              <w:gridCol w:w="639"/>
+              <w:gridCol w:w="1004"/>
             </w:tblGrid>
             <w:tr>
               <w:trPr>
@@ -14964,7 +15121,7 @@
               </w:trPr>
               <w:tc>
                 <w:tcPr>
-                  <w:tcW w:w="2084" w:type="dxa"/>
+                  <w:tcW w:w="1826" w:type="dxa"/>
                   <w:tcBorders>
                     <w:bottom w:val="single" w:sz="4" w:space="0" w:color="000000"/>
                   </w:tcBorders>
@@ -14993,7 +15150,7 @@
               </w:tc>
               <w:tc>
                 <w:tcPr>
-                  <w:tcW w:w="2293" w:type="dxa"/>
+                  <w:tcW w:w="2009" w:type="dxa"/>
                   <w:tcBorders>
                     <w:bottom w:val="single" w:sz="4" w:space="0" w:color="000000"/>
                   </w:tcBorders>
@@ -15051,7 +15208,7 @@
               </w:tc>
               <w:tc>
                 <w:tcPr>
-                  <w:tcW w:w="938" w:type="dxa"/>
+                  <w:tcW w:w="821" w:type="dxa"/>
                   <w:tcBorders>
                     <w:bottom w:val="single" w:sz="4" w:space="0" w:color="000000"/>
                   </w:tcBorders>
@@ -15098,7 +15255,7 @@
               </w:tc>
               <w:tc>
                 <w:tcPr>
-                  <w:tcW w:w="938" w:type="dxa"/>
+                  <w:tcW w:w="821" w:type="dxa"/>
                   <w:tcBorders>
                     <w:bottom w:val="single" w:sz="4" w:space="0" w:color="000000"/>
                   </w:tcBorders>
@@ -15145,7 +15302,7 @@
               </w:tc>
               <w:tc>
                 <w:tcPr>
-                  <w:tcW w:w="938" w:type="dxa"/>
+                  <w:tcW w:w="1095" w:type="dxa"/>
                   <w:tcBorders>
                     <w:bottom w:val="single" w:sz="4" w:space="0" w:color="000000"/>
                   </w:tcBorders>
@@ -15174,7 +15331,7 @@
               </w:tc>
               <w:tc>
                 <w:tcPr>
-                  <w:tcW w:w="833" w:type="dxa"/>
+                  <w:tcW w:w="1004" w:type="dxa"/>
                   <w:tcBorders>
                     <w:bottom w:val="single" w:sz="4" w:space="0" w:color="000000"/>
                   </w:tcBorders>
@@ -15203,7 +15360,7 @@
               </w:tc>
               <w:tc>
                 <w:tcPr>
-                  <w:tcW w:w="938" w:type="dxa"/>
+                  <w:tcW w:w="1095" w:type="dxa"/>
                   <w:tcBorders>
                     <w:bottom w:val="single" w:sz="4" w:space="0" w:color="000000"/>
                   </w:tcBorders>
@@ -15232,7 +15389,7 @@
               </w:tc>
               <w:tc>
                 <w:tcPr>
-                  <w:tcW w:w="521" w:type="dxa"/>
+                  <w:tcW w:w="639" w:type="dxa"/>
                   <w:tcBorders>
                     <w:bottom w:val="single" w:sz="4" w:space="0" w:color="000000"/>
                   </w:tcBorders>
@@ -15261,7 +15418,7 @@
               </w:tc>
               <w:tc>
                 <w:tcPr>
-                  <w:tcW w:w="833" w:type="dxa"/>
+                  <w:tcW w:w="1004" w:type="dxa"/>
                   <w:tcBorders>
                     <w:bottom w:val="single" w:sz="4" w:space="0" w:color="000000"/>
                   </w:tcBorders>
@@ -15295,7 +15452,7 @@
               </w:trPr>
               <w:tc>
                 <w:tcPr>
-                  <w:tcW w:w="2084" w:type="dxa"/>
+                  <w:tcW w:w="1826" w:type="dxa"/>
                   <w:tcMar>
                     <w:left w:w="60" w:type="dxa"/>
                     <w:right w:w="60" w:type="dxa"/>
@@ -15321,7 +15478,7 @@
               </w:tc>
               <w:tc>
                 <w:tcPr>
-                  <w:tcW w:w="2293" w:type="dxa"/>
+                  <w:tcW w:w="2009" w:type="dxa"/>
                   <w:tcMar>
                     <w:left w:w="60" w:type="dxa"/>
                     <w:right w:w="60" w:type="dxa"/>
@@ -15347,7 +15504,7 @@
               </w:tc>
               <w:tc>
                 <w:tcPr>
-                  <w:tcW w:w="938" w:type="dxa"/>
+                  <w:tcW w:w="821" w:type="dxa"/>
                   <w:tcMar>
                     <w:left w:w="60" w:type="dxa"/>
                     <w:right w:w="60" w:type="dxa"/>
@@ -15373,7 +15530,7 @@
               </w:tc>
               <w:tc>
                 <w:tcPr>
-                  <w:tcW w:w="938" w:type="dxa"/>
+                  <w:tcW w:w="821" w:type="dxa"/>
                   <w:tcMar>
                     <w:left w:w="60" w:type="dxa"/>
                     <w:right w:w="60" w:type="dxa"/>
@@ -15399,7 +15556,7 @@
               </w:tc>
               <w:tc>
                 <w:tcPr>
-                  <w:tcW w:w="938" w:type="dxa"/>
+                  <w:tcW w:w="1095" w:type="dxa"/>
                   <w:tcMar>
                     <w:left w:w="60" w:type="dxa"/>
                     <w:right w:w="60" w:type="dxa"/>
@@ -15425,7 +15582,7 @@
               </w:tc>
               <w:tc>
                 <w:tcPr>
-                  <w:tcW w:w="833" w:type="dxa"/>
+                  <w:tcW w:w="1004" w:type="dxa"/>
                   <w:tcMar>
                     <w:left w:w="60" w:type="dxa"/>
                     <w:right w:w="60" w:type="dxa"/>
@@ -15451,7 +15608,7 @@
               </w:tc>
               <w:tc>
                 <w:tcPr>
-                  <w:tcW w:w="938" w:type="dxa"/>
+                  <w:tcW w:w="1095" w:type="dxa"/>
                   <w:tcMar>
                     <w:left w:w="60" w:type="dxa"/>
                     <w:right w:w="60" w:type="dxa"/>
@@ -15477,7 +15634,7 @@
               </w:tc>
               <w:tc>
                 <w:tcPr>
-                  <w:tcW w:w="521" w:type="dxa"/>
+                  <w:tcW w:w="639" w:type="dxa"/>
                   <w:tcMar>
                     <w:left w:w="60" w:type="dxa"/>
                     <w:right w:w="60" w:type="dxa"/>
@@ -15503,7 +15660,7 @@
               </w:tc>
               <w:tc>
                 <w:tcPr>
-                  <w:tcW w:w="833" w:type="dxa"/>
+                  <w:tcW w:w="1004" w:type="dxa"/>
                   <w:tcMar>
                     <w:left w:w="60" w:type="dxa"/>
                     <w:right w:w="60" w:type="dxa"/>
@@ -15534,7 +15691,7 @@
               </w:trPr>
               <w:tc>
                 <w:tcPr>
-                  <w:tcW w:w="2084" w:type="dxa"/>
+                  <w:tcW w:w="1826" w:type="dxa"/>
                   <w:tcMar>
                     <w:left w:w="60" w:type="dxa"/>
                     <w:right w:w="60" w:type="dxa"/>
@@ -15560,7 +15717,7 @@
               </w:tc>
               <w:tc>
                 <w:tcPr>
-                  <w:tcW w:w="2293" w:type="dxa"/>
+                  <w:tcW w:w="2009" w:type="dxa"/>
                   <w:tcMar>
                     <w:left w:w="60" w:type="dxa"/>
                     <w:right w:w="60" w:type="dxa"/>
@@ -15586,7 +15743,7 @@
               </w:tc>
               <w:tc>
                 <w:tcPr>
-                  <w:tcW w:w="938" w:type="dxa"/>
+                  <w:tcW w:w="821" w:type="dxa"/>
                   <w:tcMar>
                     <w:left w:w="60" w:type="dxa"/>
                     <w:right w:w="60" w:type="dxa"/>
@@ -15612,7 +15769,7 @@
               </w:tc>
               <w:tc>
                 <w:tcPr>
-                  <w:tcW w:w="938" w:type="dxa"/>
+                  <w:tcW w:w="821" w:type="dxa"/>
                   <w:tcMar>
                     <w:left w:w="60" w:type="dxa"/>
                     <w:right w:w="60" w:type="dxa"/>
@@ -15638,7 +15795,7 @@
               </w:tc>
               <w:tc>
                 <w:tcPr>
-                  <w:tcW w:w="938" w:type="dxa"/>
+                  <w:tcW w:w="1095" w:type="dxa"/>
                   <w:tcMar>
                     <w:left w:w="60" w:type="dxa"/>
                     <w:right w:w="60" w:type="dxa"/>
@@ -15664,7 +15821,7 @@
               </w:tc>
               <w:tc>
                 <w:tcPr>
-                  <w:tcW w:w="833" w:type="dxa"/>
+                  <w:tcW w:w="1004" w:type="dxa"/>
                   <w:tcMar>
                     <w:left w:w="60" w:type="dxa"/>
                     <w:right w:w="60" w:type="dxa"/>
@@ -15690,7 +15847,7 @@
               </w:tc>
               <w:tc>
                 <w:tcPr>
-                  <w:tcW w:w="938" w:type="dxa"/>
+                  <w:tcW w:w="1095" w:type="dxa"/>
                   <w:tcMar>
                     <w:left w:w="60" w:type="dxa"/>
                     <w:right w:w="60" w:type="dxa"/>
@@ -15716,7 +15873,7 @@
               </w:tc>
               <w:tc>
                 <w:tcPr>
-                  <w:tcW w:w="521" w:type="dxa"/>
+                  <w:tcW w:w="639" w:type="dxa"/>
                   <w:tcMar>
                     <w:left w:w="60" w:type="dxa"/>
                     <w:right w:w="60" w:type="dxa"/>
@@ -15742,7 +15899,7 @@
               </w:tc>
               <w:tc>
                 <w:tcPr>
-                  <w:tcW w:w="833" w:type="dxa"/>
+                  <w:tcW w:w="1004" w:type="dxa"/>
                   <w:tcMar>
                     <w:left w:w="60" w:type="dxa"/>
                     <w:right w:w="60" w:type="dxa"/>
@@ -15773,7 +15930,7 @@
               </w:trPr>
               <w:tc>
                 <w:tcPr>
-                  <w:tcW w:w="2084" w:type="dxa"/>
+                  <w:tcW w:w="1826" w:type="dxa"/>
                   <w:tcMar>
                     <w:left w:w="60" w:type="dxa"/>
                     <w:right w:w="60" w:type="dxa"/>
@@ -15799,7 +15956,7 @@
               </w:tc>
               <w:tc>
                 <w:tcPr>
-                  <w:tcW w:w="2293" w:type="dxa"/>
+                  <w:tcW w:w="2009" w:type="dxa"/>
                   <w:tcMar>
                     <w:left w:w="60" w:type="dxa"/>
                     <w:right w:w="60" w:type="dxa"/>
@@ -15825,7 +15982,7 @@
               </w:tc>
               <w:tc>
                 <w:tcPr>
-                  <w:tcW w:w="938" w:type="dxa"/>
+                  <w:tcW w:w="821" w:type="dxa"/>
                   <w:tcMar>
                     <w:left w:w="60" w:type="dxa"/>
                     <w:right w:w="60" w:type="dxa"/>
@@ -15851,7 +16008,7 @@
               </w:tc>
               <w:tc>
                 <w:tcPr>
-                  <w:tcW w:w="938" w:type="dxa"/>
+                  <w:tcW w:w="821" w:type="dxa"/>
                   <w:tcMar>
                     <w:left w:w="60" w:type="dxa"/>
                     <w:right w:w="60" w:type="dxa"/>
@@ -15877,7 +16034,7 @@
               </w:tc>
               <w:tc>
                 <w:tcPr>
-                  <w:tcW w:w="938" w:type="dxa"/>
+                  <w:tcW w:w="1095" w:type="dxa"/>
                   <w:tcMar>
                     <w:left w:w="60" w:type="dxa"/>
                     <w:right w:w="60" w:type="dxa"/>
@@ -15903,7 +16060,7 @@
               </w:tc>
               <w:tc>
                 <w:tcPr>
-                  <w:tcW w:w="833" w:type="dxa"/>
+                  <w:tcW w:w="1004" w:type="dxa"/>
                   <w:tcMar>
                     <w:left w:w="60" w:type="dxa"/>
                     <w:right w:w="60" w:type="dxa"/>
@@ -15929,7 +16086,7 @@
               </w:tc>
               <w:tc>
                 <w:tcPr>
-                  <w:tcW w:w="938" w:type="dxa"/>
+                  <w:tcW w:w="1095" w:type="dxa"/>
                   <w:tcMar>
                     <w:left w:w="60" w:type="dxa"/>
                     <w:right w:w="60" w:type="dxa"/>
@@ -15955,7 +16112,7 @@
               </w:tc>
               <w:tc>
                 <w:tcPr>
-                  <w:tcW w:w="521" w:type="dxa"/>
+                  <w:tcW w:w="639" w:type="dxa"/>
                   <w:tcMar>
                     <w:left w:w="60" w:type="dxa"/>
                     <w:right w:w="60" w:type="dxa"/>
@@ -15981,7 +16138,7 @@
               </w:tc>
               <w:tc>
                 <w:tcPr>
-                  <w:tcW w:w="833" w:type="dxa"/>
+                  <w:tcW w:w="1004" w:type="dxa"/>
                   <w:tcMar>
                     <w:left w:w="60" w:type="dxa"/>
                     <w:right w:w="60" w:type="dxa"/>
@@ -16012,7 +16169,7 @@
               </w:trPr>
               <w:tc>
                 <w:tcPr>
-                  <w:tcW w:w="2084" w:type="dxa"/>
+                  <w:tcW w:w="1826" w:type="dxa"/>
                   <w:tcMar>
                     <w:left w:w="60" w:type="dxa"/>
                     <w:right w:w="60" w:type="dxa"/>
@@ -16038,7 +16195,7 @@
               </w:tc>
               <w:tc>
                 <w:tcPr>
-                  <w:tcW w:w="2293" w:type="dxa"/>
+                  <w:tcW w:w="2009" w:type="dxa"/>
                   <w:tcMar>
                     <w:left w:w="60" w:type="dxa"/>
                     <w:right w:w="60" w:type="dxa"/>
@@ -16064,7 +16221,7 @@
               </w:tc>
               <w:tc>
                 <w:tcPr>
-                  <w:tcW w:w="938" w:type="dxa"/>
+                  <w:tcW w:w="821" w:type="dxa"/>
                   <w:tcMar>
                     <w:left w:w="60" w:type="dxa"/>
                     <w:right w:w="60" w:type="dxa"/>
@@ -16090,7 +16247,7 @@
               </w:tc>
               <w:tc>
                 <w:tcPr>
-                  <w:tcW w:w="938" w:type="dxa"/>
+                  <w:tcW w:w="821" w:type="dxa"/>
                   <w:tcMar>
                     <w:left w:w="60" w:type="dxa"/>
                     <w:right w:w="60" w:type="dxa"/>
@@ -16116,7 +16273,7 @@
               </w:tc>
               <w:tc>
                 <w:tcPr>
-                  <w:tcW w:w="938" w:type="dxa"/>
+                  <w:tcW w:w="1095" w:type="dxa"/>
                   <w:tcMar>
                     <w:left w:w="60" w:type="dxa"/>
                     <w:right w:w="60" w:type="dxa"/>
@@ -16142,7 +16299,7 @@
               </w:tc>
               <w:tc>
                 <w:tcPr>
-                  <w:tcW w:w="833" w:type="dxa"/>
+                  <w:tcW w:w="1004" w:type="dxa"/>
                   <w:tcMar>
                     <w:left w:w="60" w:type="dxa"/>
                     <w:right w:w="60" w:type="dxa"/>
@@ -16168,7 +16325,7 @@
               </w:tc>
               <w:tc>
                 <w:tcPr>
-                  <w:tcW w:w="938" w:type="dxa"/>
+                  <w:tcW w:w="1095" w:type="dxa"/>
                   <w:tcMar>
                     <w:left w:w="60" w:type="dxa"/>
                     <w:right w:w="60" w:type="dxa"/>
@@ -16194,7 +16351,7 @@
               </w:tc>
               <w:tc>
                 <w:tcPr>
-                  <w:tcW w:w="521" w:type="dxa"/>
+                  <w:tcW w:w="639" w:type="dxa"/>
                   <w:tcMar>
                     <w:left w:w="60" w:type="dxa"/>
                     <w:right w:w="60" w:type="dxa"/>
@@ -16220,7 +16377,7 @@
               </w:tc>
               <w:tc>
                 <w:tcPr>
-                  <w:tcW w:w="833" w:type="dxa"/>
+                  <w:tcW w:w="1004" w:type="dxa"/>
                   <w:tcMar>
                     <w:left w:w="60" w:type="dxa"/>
                     <w:right w:w="60" w:type="dxa"/>
@@ -16251,7 +16408,7 @@
               </w:trPr>
               <w:tc>
                 <w:tcPr>
-                  <w:tcW w:w="2084" w:type="dxa"/>
+                  <w:tcW w:w="1826" w:type="dxa"/>
                   <w:tcBorders>
                     <w:top w:val="single" w:sz="4" w:space="0" w:color="000000"/>
                   </w:tcBorders>
@@ -16280,7 +16437,7 @@
               </w:tc>
               <w:tc>
                 <w:tcPr>
-                  <w:tcW w:w="2293" w:type="dxa"/>
+                  <w:tcW w:w="2009" w:type="dxa"/>
                   <w:tcBorders>
                     <w:top w:val="single" w:sz="4" w:space="0" w:color="000000"/>
                   </w:tcBorders>
@@ -16309,7 +16466,7 @@
               </w:tc>
               <w:tc>
                 <w:tcPr>
-                  <w:tcW w:w="938" w:type="dxa"/>
+                  <w:tcW w:w="821" w:type="dxa"/>
                   <w:tcBorders>
                     <w:top w:val="single" w:sz="4" w:space="0" w:color="000000"/>
                   </w:tcBorders>
@@ -16338,7 +16495,7 @@
               </w:tc>
               <w:tc>
                 <w:tcPr>
-                  <w:tcW w:w="938" w:type="dxa"/>
+                  <w:tcW w:w="821" w:type="dxa"/>
                   <w:tcBorders>
                     <w:top w:val="single" w:sz="4" w:space="0" w:color="000000"/>
                   </w:tcBorders>
@@ -16367,7 +16524,7 @@
               </w:tc>
               <w:tc>
                 <w:tcPr>
-                  <w:tcW w:w="938" w:type="dxa"/>
+                  <w:tcW w:w="1095" w:type="dxa"/>
                   <w:tcBorders>
                     <w:top w:val="single" w:sz="4" w:space="0" w:color="000000"/>
                   </w:tcBorders>
@@ -16396,7 +16553,7 @@
               </w:tc>
               <w:tc>
                 <w:tcPr>
-                  <w:tcW w:w="833" w:type="dxa"/>
+                  <w:tcW w:w="1004" w:type="dxa"/>
                   <w:tcBorders>
                     <w:top w:val="single" w:sz="4" w:space="0" w:color="000000"/>
                   </w:tcBorders>
@@ -16425,7 +16582,7 @@
               </w:tc>
               <w:tc>
                 <w:tcPr>
-                  <w:tcW w:w="938" w:type="dxa"/>
+                  <w:tcW w:w="1095" w:type="dxa"/>
                   <w:tcBorders>
                     <w:top w:val="single" w:sz="4" w:space="0" w:color="000000"/>
                   </w:tcBorders>
@@ -16454,7 +16611,7 @@
               </w:tc>
               <w:tc>
                 <w:tcPr>
-                  <w:tcW w:w="521" w:type="dxa"/>
+                  <w:tcW w:w="639" w:type="dxa"/>
                   <w:tcBorders>
                     <w:top w:val="single" w:sz="4" w:space="0" w:color="000000"/>
                   </w:tcBorders>
@@ -16483,7 +16640,7 @@
               </w:tc>
               <w:tc>
                 <w:tcPr>
-                  <w:tcW w:w="833" w:type="dxa"/>
+                  <w:tcW w:w="1004" w:type="dxa"/>
                   <w:tcBorders>
                     <w:top w:val="single" w:sz="4" w:space="0" w:color="000000"/>
                   </w:tcBorders>
@@ -16517,7 +16674,7 @@
               </w:trPr>
               <w:tc>
                 <w:tcPr>
-                  <w:tcW w:w="2084" w:type="dxa"/>
+                  <w:tcW w:w="1826" w:type="dxa"/>
                   <w:tcMar>
                     <w:left w:w="60" w:type="dxa"/>
                     <w:right w:w="60" w:type="dxa"/>
@@ -16543,7 +16700,7 @@
               </w:tc>
               <w:tc>
                 <w:tcPr>
-                  <w:tcW w:w="2293" w:type="dxa"/>
+                  <w:tcW w:w="2009" w:type="dxa"/>
                   <w:tcMar>
                     <w:left w:w="60" w:type="dxa"/>
                     <w:right w:w="60" w:type="dxa"/>
@@ -16569,7 +16726,7 @@
               </w:tc>
               <w:tc>
                 <w:tcPr>
-                  <w:tcW w:w="938" w:type="dxa"/>
+                  <w:tcW w:w="821" w:type="dxa"/>
                   <w:tcMar>
                     <w:left w:w="60" w:type="dxa"/>
                     <w:right w:w="60" w:type="dxa"/>
@@ -16595,7 +16752,7 @@
               </w:tc>
               <w:tc>
                 <w:tcPr>
-                  <w:tcW w:w="938" w:type="dxa"/>
+                  <w:tcW w:w="821" w:type="dxa"/>
                   <w:tcMar>
                     <w:left w:w="60" w:type="dxa"/>
                     <w:right w:w="60" w:type="dxa"/>
@@ -16621,7 +16778,7 @@
               </w:tc>
               <w:tc>
                 <w:tcPr>
-                  <w:tcW w:w="938" w:type="dxa"/>
+                  <w:tcW w:w="1095" w:type="dxa"/>
                   <w:tcMar>
                     <w:left w:w="60" w:type="dxa"/>
                     <w:right w:w="60" w:type="dxa"/>
@@ -16647,7 +16804,7 @@
               </w:tc>
               <w:tc>
                 <w:tcPr>
-                  <w:tcW w:w="833" w:type="dxa"/>
+                  <w:tcW w:w="1004" w:type="dxa"/>
                   <w:tcMar>
                     <w:left w:w="60" w:type="dxa"/>
                     <w:right w:w="60" w:type="dxa"/>
@@ -16673,7 +16830,7 @@
               </w:tc>
               <w:tc>
                 <w:tcPr>
-                  <w:tcW w:w="938" w:type="dxa"/>
+                  <w:tcW w:w="1095" w:type="dxa"/>
                   <w:tcMar>
                     <w:left w:w="60" w:type="dxa"/>
                     <w:right w:w="60" w:type="dxa"/>
@@ -16699,7 +16856,7 @@
               </w:tc>
               <w:tc>
                 <w:tcPr>
-                  <w:tcW w:w="521" w:type="dxa"/>
+                  <w:tcW w:w="639" w:type="dxa"/>
                   <w:tcMar>
                     <w:left w:w="60" w:type="dxa"/>
                     <w:right w:w="60" w:type="dxa"/>
@@ -16725,7 +16882,7 @@
               </w:tc>
               <w:tc>
                 <w:tcPr>
-                  <w:tcW w:w="833" w:type="dxa"/>
+                  <w:tcW w:w="1004" w:type="dxa"/>
                   <w:tcMar>
                     <w:left w:w="60" w:type="dxa"/>
                     <w:right w:w="60" w:type="dxa"/>
@@ -16756,7 +16913,7 @@
               </w:trPr>
               <w:tc>
                 <w:tcPr>
-                  <w:tcW w:w="2084" w:type="dxa"/>
+                  <w:tcW w:w="1826" w:type="dxa"/>
                   <w:tcMar>
                     <w:left w:w="60" w:type="dxa"/>
                     <w:right w:w="60" w:type="dxa"/>
@@ -16781,7 +16938,7 @@
               </w:tc>
               <w:tc>
                 <w:tcPr>
-                  <w:tcW w:w="2293" w:type="dxa"/>
+                  <w:tcW w:w="2009" w:type="dxa"/>
                   <w:tcMar>
                     <w:left w:w="60" w:type="dxa"/>
                     <w:right w:w="60" w:type="dxa"/>
@@ -16806,7 +16963,7 @@
               </w:tc>
               <w:tc>
                 <w:tcPr>
-                  <w:tcW w:w="938" w:type="dxa"/>
+                  <w:tcW w:w="821" w:type="dxa"/>
                   <w:tcMar>
                     <w:left w:w="60" w:type="dxa"/>
                     <w:right w:w="60" w:type="dxa"/>
@@ -16831,7 +16988,7 @@
               </w:tc>
               <w:tc>
                 <w:tcPr>
-                  <w:tcW w:w="938" w:type="dxa"/>
+                  <w:tcW w:w="821" w:type="dxa"/>
                   <w:tcMar>
                     <w:left w:w="60" w:type="dxa"/>
                     <w:right w:w="60" w:type="dxa"/>
@@ -16856,7 +17013,7 @@
               </w:tc>
               <w:tc>
                 <w:tcPr>
-                  <w:tcW w:w="938" w:type="dxa"/>
+                  <w:tcW w:w="1095" w:type="dxa"/>
                   <w:tcMar>
                     <w:left w:w="60" w:type="dxa"/>
                     <w:right w:w="60" w:type="dxa"/>
@@ -16881,7 +17038,7 @@
               </w:tc>
               <w:tc>
                 <w:tcPr>
-                  <w:tcW w:w="833" w:type="dxa"/>
+                  <w:tcW w:w="1004" w:type="dxa"/>
                   <w:tcMar>
                     <w:left w:w="60" w:type="dxa"/>
                     <w:right w:w="60" w:type="dxa"/>
@@ -16906,7 +17063,7 @@
               </w:tc>
               <w:tc>
                 <w:tcPr>
-                  <w:tcW w:w="938" w:type="dxa"/>
+                  <w:tcW w:w="1095" w:type="dxa"/>
                   <w:tcMar>
                     <w:left w:w="60" w:type="dxa"/>
                     <w:right w:w="60" w:type="dxa"/>
@@ -16931,7 +17088,7 @@
               </w:tc>
               <w:tc>
                 <w:tcPr>
-                  <w:tcW w:w="521" w:type="dxa"/>
+                  <w:tcW w:w="639" w:type="dxa"/>
                   <w:tcMar>
                     <w:left w:w="60" w:type="dxa"/>
                     <w:right w:w="60" w:type="dxa"/>
@@ -16956,7 +17113,7 @@
               </w:tc>
               <w:tc>
                 <w:tcPr>
-                  <w:tcW w:w="833" w:type="dxa"/>
+                  <w:tcW w:w="1004" w:type="dxa"/>
                   <w:tcMar>
                     <w:left w:w="60" w:type="dxa"/>
                     <w:right w:w="60" w:type="dxa"/>
@@ -19330,7 +19487,7 @@
           <w:rFonts w:ascii="Times New Roman" w:hAnsi="Times New Roman" w:cs="Times New Roman" w:eastAsia="Times New Roman"/>
           <w:color w:val="000000"/>
         </w:rPr>
-        <w:t xml:space="preserve">[23]; the controller does not distinguish these.</w:t>
+        <w:t xml:space="preserve">[24]; the controller does not distinguish these.</w:t>
       </w:r>
       <w:r>
         <w:rPr>
@@ -19373,20 +19530,6 @@
           <w:color w:val="000000"/>
         </w:rPr>
         <w:t xml:space="preserve">2.7 s guided) calls for prefetching or caching.</w:t>
-      </w:r>
-      <w:r>
-        <w:rPr>
-          <w:rFonts w:ascii="Times New Roman" w:hAnsi="Times New Roman" w:cs="Times New Roman" w:eastAsia="Times New Roman"/>
-          <w:color w:val="000000"/>
-        </w:rPr>
-        <w:t xml:space="preserve"> </w:t>
-      </w:r>
-      <w:r>
-        <w:rPr>
-          <w:rFonts w:ascii="Times New Roman" w:hAnsi="Times New Roman" w:cs="Times New Roman" w:eastAsia="Times New Roman"/>
-          <w:color w:val="000000"/>
-        </w:rPr>
-        <w:t xml:space="preserve">A learned fast policy would need real interaction data.</w:t>
       </w:r>
     </w:p>
     <w:bookmarkEnd w:id="39"/>
@@ -19500,49 +19643,35 @@
           <w:rFonts w:ascii="Times New Roman" w:hAnsi="Times New Roman" w:cs="Times New Roman" w:eastAsia="Times New Roman"/>
           <w:color w:val="000000"/>
         </w:rPr>
-        <w:t xml:space="preserve">matter, and a slew limit removes level skips. Standard BKT stops reacting</w:t>
-      </w:r>
-      <w:r>
-        <w:rPr>
-          <w:rFonts w:ascii="Times New Roman" w:hAnsi="Times New Roman" w:cs="Times New Roman" w:eastAsia="Times New Roman"/>
-          <w:color w:val="000000"/>
-        </w:rPr>
-        <w:t xml:space="preserve"> </w:t>
-      </w:r>
-      <w:r>
-        <w:rPr>
-          <w:rFonts w:ascii="Times New Roman" w:hAnsi="Times New Roman" w:cs="Times New Roman" w:eastAsia="Times New Roman"/>
-          <w:color w:val="000000"/>
-        </w:rPr>
-        <w:t xml:space="preserve">after long success runs; a CUSUM lapse detector restores the reaction at</w:t>
-      </w:r>
-      <w:r>
-        <w:rPr>
-          <w:rFonts w:ascii="Times New Roman" w:hAnsi="Times New Roman" w:cs="Times New Roman" w:eastAsia="Times New Roman"/>
-          <w:color w:val="000000"/>
-        </w:rPr>
-        <w:t xml:space="preserve"> </w:t>
-      </w:r>
-      <w:r>
-        <w:rPr>
-          <w:rFonts w:ascii="Times New Roman" w:hAnsi="Times New Roman" w:cs="Times New Roman" w:eastAsia="Times New Roman"/>
-          <w:color w:val="000000"/>
-        </w:rPr>
-        <w:t xml:space="preserve">a modest cost in jitter, while forgetting trades overload for underload. In 300 single real calls, 98.7% of</w:t>
-      </w:r>
-      <w:r>
-        <w:rPr>
-          <w:rFonts w:ascii="Times New Roman" w:hAnsi="Times New Roman" w:cs="Times New Roman" w:eastAsia="Times New Roman"/>
-          <w:color w:val="000000"/>
-        </w:rPr>
-        <w:t xml:space="preserve"> </w:t>
-      </w:r>
-      <w:r>
-        <w:rPr>
-          <w:rFonts w:ascii="Times New Roman" w:hAnsi="Times New Roman" w:cs="Times New Roman" w:eastAsia="Times New Roman"/>
-          <w:color w:val="000000"/>
-        </w:rPr>
-        <w:t xml:space="preserve">screens met the budget with the planner and 92% without it. The next steps are</w:t>
+        <w:t xml:space="preserve">matter, and a slew limit removes level skips. A CUSUM lapse detector restores</w:t>
+      </w:r>
+      <w:r>
+        <w:rPr>
+          <w:rFonts w:ascii="Times New Roman" w:hAnsi="Times New Roman" w:cs="Times New Roman" w:eastAsia="Times New Roman"/>
+          <w:color w:val="000000"/>
+        </w:rPr>
+        <w:t xml:space="preserve"> </w:t>
+      </w:r>
+      <w:r>
+        <w:rPr>
+          <w:rFonts w:ascii="Times New Roman" w:hAnsi="Times New Roman" w:cs="Times New Roman" w:eastAsia="Times New Roman"/>
+          <w:color w:val="000000"/>
+        </w:rPr>
+        <w:t xml:space="preserve">BKT’s reaction after long success runs at a modest cost in jitter. In 300 single real calls, 98.7% of</w:t>
+      </w:r>
+      <w:r>
+        <w:rPr>
+          <w:rFonts w:ascii="Times New Roman" w:hAnsi="Times New Roman" w:cs="Times New Roman" w:eastAsia="Times New Roman"/>
+          <w:color w:val="000000"/>
+        </w:rPr>
+        <w:t xml:space="preserve"> </w:t>
+      </w:r>
+      <w:r>
+        <w:rPr>
+          <w:rFonts w:ascii="Times New Roman" w:hAnsi="Times New Roman" w:cs="Times New Roman" w:eastAsia="Times New Roman"/>
+          <w:color w:val="000000"/>
+        </w:rPr>
+        <w:t xml:space="preserve">raw outputs met the budget with the planner and 92% without it. The next steps are</w:t>
       </w:r>
       <w:r>
         <w:rPr>
@@ -21269,23 +21398,23 @@
           <w:color w:val="000000"/>
           <w:sz w:val="16"/>
         </w:rPr>
-        <w:t>[17] J. Sweller,</w:t>
-      </w:r>
-      <w:r>
-        <w:rPr>
-          <w:rFonts w:ascii="Times New Roman" w:hAnsi="Times New Roman" w:cs="Times New Roman" w:eastAsia="Times New Roman"/>
-          <w:color w:val="000000"/>
-          <w:sz w:val="16"/>
-        </w:rPr>
-        <w:t xml:space="preserve"> </w:t>
-      </w:r>
-      <w:r>
-        <w:rPr>
-          <w:rFonts w:ascii="Times New Roman" w:hAnsi="Times New Roman" w:cs="Times New Roman" w:eastAsia="Times New Roman"/>
-          <w:color w:val="000000"/>
-          <w:sz w:val="16"/>
-        </w:rPr>
-        <w:t xml:space="preserve">“Cognitive load during problem solving: Effects on learning,”</w:t>
+        <w:t>[17] H. Levitt,</w:t>
+      </w:r>
+      <w:r>
+        <w:rPr>
+          <w:rFonts w:ascii="Times New Roman" w:hAnsi="Times New Roman" w:cs="Times New Roman" w:eastAsia="Times New Roman"/>
+          <w:color w:val="000000"/>
+          <w:sz w:val="16"/>
+        </w:rPr>
+        <w:t xml:space="preserve"> </w:t>
+      </w:r>
+      <w:r>
+        <w:rPr>
+          <w:rFonts w:ascii="Times New Roman" w:hAnsi="Times New Roman" w:cs="Times New Roman" w:eastAsia="Times New Roman"/>
+          <w:color w:val="000000"/>
+          <w:sz w:val="16"/>
+        </w:rPr>
+        <w:t xml:space="preserve">“Transformed up-down methods in psychoacoustics,”</w:t>
       </w:r>
       <w:r>
         <w:rPr>
@@ -21303,6 +21432,83 @@
           <w:color w:val="000000"/>
           <w:sz w:val="16"/>
         </w:rPr>
+        <w:t xml:space="preserve">The Journal of the Acoustical Society of America</w:t>
+      </w:r>
+      <w:r>
+        <w:rPr>
+          <w:rFonts w:ascii="Times New Roman" w:hAnsi="Times New Roman" w:cs="Times New Roman" w:eastAsia="Times New Roman"/>
+          <w:color w:val="000000"/>
+          <w:sz w:val="16"/>
+        </w:rPr>
+        <w:t xml:space="preserve">, vol. 49, no. 2B, pp. 467–477, 1971. [Online]. Available:</w:t>
+      </w:r>
+      <w:r>
+        <w:rPr>
+          <w:rFonts w:ascii="Times New Roman" w:hAnsi="Times New Roman" w:cs="Times New Roman" w:eastAsia="Times New Roman"/>
+          <w:color w:val="000000"/>
+          <w:sz w:val="16"/>
+        </w:rPr>
+        <w:t xml:space="preserve"> </w:t>
+      </w:r>
+      <w:hyperlink r:id="rId58">
+        <w:r>
+          <w:rPr>
+            <w:rStyle w:val="Hyperlink"/>
+            <w:rFonts w:ascii="Times New Roman" w:hAnsi="Times New Roman" w:cs="Times New Roman" w:eastAsia="Times New Roman"/>
+            <w:color w:val="000000"/>
+            <w:sz w:val="16"/>
+          </w:rPr>
+          <w:t xml:space="preserve">https://doi.org/10.1121/1.1912375</w:t>
+        </w:r>
+      </w:hyperlink>
+    </w:p>
+    <w:p>
+      <w:pPr>
+        <w:pStyle w:val="BodyText"/>
+        <w:spacing w:before="0" w:after="0" w:line="180" w:lineRule="exact"/>
+        <w:ind w:hanging="360" w:left="360"/>
+        <w:jc w:val="left"/>
+      </w:pPr>
+      <w:r>
+        <w:rPr>
+          <w:rFonts w:ascii="Times New Roman" w:hAnsi="Times New Roman" w:cs="Times New Roman" w:eastAsia="Times New Roman"/>
+          <w:color w:val="000000"/>
+          <w:sz w:val="16"/>
+        </w:rPr>
+        <w:t>[18] J. Sweller,</w:t>
+      </w:r>
+      <w:r>
+        <w:rPr>
+          <w:rFonts w:ascii="Times New Roman" w:hAnsi="Times New Roman" w:cs="Times New Roman" w:eastAsia="Times New Roman"/>
+          <w:color w:val="000000"/>
+          <w:sz w:val="16"/>
+        </w:rPr>
+        <w:t xml:space="preserve"> </w:t>
+      </w:r>
+      <w:r>
+        <w:rPr>
+          <w:rFonts w:ascii="Times New Roman" w:hAnsi="Times New Roman" w:cs="Times New Roman" w:eastAsia="Times New Roman"/>
+          <w:color w:val="000000"/>
+          <w:sz w:val="16"/>
+        </w:rPr>
+        <w:t xml:space="preserve">“Cognitive load during problem solving: Effects on learning,”</w:t>
+      </w:r>
+      <w:r>
+        <w:rPr>
+          <w:rFonts w:ascii="Times New Roman" w:hAnsi="Times New Roman" w:cs="Times New Roman" w:eastAsia="Times New Roman"/>
+          <w:color w:val="000000"/>
+          <w:sz w:val="16"/>
+        </w:rPr>
+        <w:t xml:space="preserve"> </w:t>
+      </w:r>
+      <w:r>
+        <w:rPr>
+          <w:rFonts w:ascii="Times New Roman" w:hAnsi="Times New Roman" w:cs="Times New Roman" w:eastAsia="Times New Roman"/>
+          <w:i/>
+          <w:iCs/>
+          <w:color w:val="000000"/>
+          <w:sz w:val="16"/>
+        </w:rPr>
         <w:t xml:space="preserve">Cognitive Science</w:t>
       </w:r>
       <w:r>
@@ -21321,7 +21527,7 @@
         </w:rPr>
         <w:t xml:space="preserve"> </w:t>
       </w:r>
-      <w:hyperlink r:id="rId58">
+      <w:hyperlink r:id="rId59">
         <w:r>
           <w:rPr>
             <w:rStyle w:val="Hyperlink"/>
@@ -21346,7 +21552,7 @@
           <w:color w:val="000000"/>
           <w:sz w:val="16"/>
         </w:rPr>
-        <w:t>[18] ——,</w:t>
+        <w:t>[19] ——,</w:t>
       </w:r>
       <w:r>
         <w:rPr>
@@ -21398,7 +21604,7 @@
         </w:rPr>
         <w:t xml:space="preserve"> </w:t>
       </w:r>
-      <w:hyperlink r:id="rId59">
+      <w:hyperlink r:id="rId60">
         <w:r>
           <w:rPr>
             <w:rStyle w:val="Hyperlink"/>
@@ -21423,7 +21629,7 @@
           <w:color w:val="000000"/>
           <w:sz w:val="16"/>
         </w:rPr>
-        <w:t>[19] J. Sweller and G. A. Cooper,</w:t>
+        <w:t>[20] J. Sweller and G. A. Cooper,</w:t>
       </w:r>
       <w:r>
         <w:rPr>
@@ -21475,7 +21681,7 @@
         </w:rPr>
         <w:t xml:space="preserve"> </w:t>
       </w:r>
-      <w:hyperlink r:id="rId60">
+      <w:hyperlink r:id="rId61">
         <w:r>
           <w:rPr>
             <w:rStyle w:val="Hyperlink"/>
@@ -21500,7 +21706,7 @@
           <w:color w:val="000000"/>
           <w:sz w:val="16"/>
         </w:rPr>
-        <w:t>[20] E. R. Fyfe, N. M. McNeil, J. Y. Son, and R. L. Goldstone,</w:t>
+        <w:t>[21] E. R. Fyfe, N. M. McNeil, J. Y. Son, and R. L. Goldstone,</w:t>
       </w:r>
       <w:r>
         <w:rPr>
@@ -21552,7 +21758,7 @@
         </w:rPr>
         <w:t xml:space="preserve"> </w:t>
       </w:r>
-      <w:hyperlink r:id="rId61">
+      <w:hyperlink r:id="rId62">
         <w:r>
           <w:rPr>
             <w:rStyle w:val="Hyperlink"/>
@@ -21577,7 +21783,7 @@
           <w:color w:val="000000"/>
           <w:sz w:val="16"/>
         </w:rPr>
-        <w:t>[21] J. Vlassis,</w:t>
+        <w:t>[22] J. Vlassis,</w:t>
       </w:r>
       <w:r>
         <w:rPr>
@@ -21629,7 +21835,7 @@
         </w:rPr>
         <w:t xml:space="preserve"> </w:t>
       </w:r>
-      <w:hyperlink r:id="rId62">
+      <w:hyperlink r:id="rId63">
         <w:r>
           <w:rPr>
             <w:rStyle w:val="Hyperlink"/>
@@ -21654,7 +21860,7 @@
           <w:color w:val="000000"/>
           <w:sz w:val="16"/>
         </w:rPr>
-        <w:t>[22] C. Kieran,</w:t>
+        <w:t>[23] C. Kieran,</w:t>
       </w:r>
       <w:r>
         <w:rPr>
@@ -21706,7 +21912,7 @@
         </w:rPr>
         <w:t xml:space="preserve"> </w:t>
       </w:r>
-      <w:hyperlink r:id="rId63">
+      <w:hyperlink r:id="rId64">
         <w:r>
           <w:rPr>
             <w:rStyle w:val="Hyperlink"/>
@@ -21731,7 +21937,7 @@
           <w:color w:val="000000"/>
           <w:sz w:val="16"/>
         </w:rPr>
-        <w:t>[23] J. L. Booth, C. Barbieri, F. Eyer, and E. J. Par</w:t>
+        <w:t>[24] J. L. Booth, C. Barbieri, F. Eyer, and E. J. Par</w:t>
       </w:r>
       <w:r>
         <w:rPr>
@@ -21799,7 +22005,7 @@
         </w:rPr>
         <w:t xml:space="preserve"> </w:t>
       </w:r>
-      <w:hyperlink r:id="rId64">
+      <w:hyperlink r:id="rId65">
         <w:r>
           <w:rPr>
             <w:rStyle w:val="Hyperlink"/>
@@ -21824,7 +22030,7 @@
           <w:color w:val="000000"/>
           <w:sz w:val="16"/>
         </w:rPr>
-        <w:t>[24] K. J.</w:t>
+        <w:t>[25] K. J.</w:t>
       </w:r>
       <w:r>
         <w:rPr>
@@ -21962,7 +22168,7 @@
           <w:color w:val="000000"/>
           <w:sz w:val="16"/>
         </w:rPr>
-        <w:t>[25] K. J.</w:t>
+        <w:t>[26] K. J.</w:t>
       </w:r>
       <w:r>
         <w:rPr>
@@ -22070,7 +22276,7 @@
         </w:rPr>
         <w:t xml:space="preserve"> </w:t>
       </w:r>
-      <w:hyperlink r:id="rId65">
+      <w:hyperlink r:id="rId66">
         <w:r>
           <w:rPr>
             <w:rStyle w:val="Hyperlink"/>
@@ -22095,7 +22301,7 @@
           <w:color w:val="000000"/>
           <w:sz w:val="16"/>
         </w:rPr>
-        <w:t>[26] B. T. Willard and R. Louf,</w:t>
+        <w:t>[27] B. T. Willard and R. Louf,</w:t>
       </w:r>
       <w:r>
         <w:rPr>
@@ -22137,7 +22343,7 @@
         </w:rPr>
         <w:t xml:space="preserve"> </w:t>
       </w:r>
-      <w:hyperlink r:id="rId66">
+      <w:hyperlink r:id="rId67">
         <w:r>
           <w:rPr>
             <w:rStyle w:val="Hyperlink"/>
@@ -22162,7 +22368,7 @@
           <w:color w:val="000000"/>
           <w:sz w:val="16"/>
         </w:rPr>
-        <w:t>[27] S. Geng, H. Cooper, M. Moskal, S. Jenkins, J. Berman, N. Ranchin, R. West, E. Horvitz, and H. Nori,</w:t>
+        <w:t>[28] S. Geng, H. Cooper, M. Moskal, S. Jenkins, J. Berman, N. Ranchin, R. West, E. Horvitz, and H. Nori,</w:t>
       </w:r>
       <w:r>
         <w:rPr>
@@ -22220,7 +22426,7 @@
         </w:rPr>
         <w:t xml:space="preserve"> </w:t>
       </w:r>
-      <w:hyperlink r:id="rId67">
+      <w:hyperlink r:id="rId68">
         <w:r>
           <w:rPr>
             <w:rStyle w:val="Hyperlink"/>
@@ -22245,7 +22451,7 @@
           <w:color w:val="000000"/>
           <w:sz w:val="16"/>
         </w:rPr>
-        <w:t>[28] J. Zhang, K. Vanacore, R. S. Baker, N. Ch, C. Mills, and O. Henkel,</w:t>
+        <w:t>[29] J. Zhang, K. Vanacore, R. S. Baker, N. Ch, C. Mills, and O. Henkel,</w:t>
       </w:r>
       <w:r>
         <w:rPr>
@@ -22345,7 +22551,7 @@
         </w:rPr>
         <w:t xml:space="preserve"> </w:t>
       </w:r>
-      <w:hyperlink r:id="rId68">
+      <w:hyperlink r:id="rId69">
         <w:r>
           <w:rPr>
             <w:rStyle w:val="Hyperlink"/>
@@ -22370,7 +22576,7 @@
           <w:color w:val="000000"/>
           <w:sz w:val="16"/>
         </w:rPr>
-        <w:t>[29] J. G. Ziegler and N. B. Nichols,</w:t>
+        <w:t>[30] J. G. Ziegler and N. B. Nichols,</w:t>
       </w:r>
       <w:r>
         <w:rPr>
@@ -22422,7 +22628,7 @@
         </w:rPr>
         <w:t xml:space="preserve"> </w:t>
       </w:r>
-      <w:hyperlink r:id="rId69">
+      <w:hyperlink r:id="rId70">
         <w:r>
           <w:rPr>
             <w:rStyle w:val="Hyperlink"/>
@@ -22447,7 +22653,7 @@
           <w:color w:val="000000"/>
           <w:sz w:val="16"/>
         </w:rPr>
-        <w:t>[30] S. Skogestad,</w:t>
+        <w:t>[31] S. Skogestad,</w:t>
       </w:r>
       <w:r>
         <w:rPr>
@@ -22531,7 +22737,7 @@
         </w:rPr>
         <w:t xml:space="preserve"> </w:t>
       </w:r>
-      <w:hyperlink r:id="rId70">
+      <w:hyperlink r:id="rId71">
         <w:r>
           <w:rPr>
             <w:rStyle w:val="Hyperlink"/>
@@ -22556,7 +22762,7 @@
           <w:color w:val="000000"/>
           <w:sz w:val="16"/>
         </w:rPr>
-        <w:t>[31] D. Graham and R. C. Lathrop,</w:t>
+        <w:t>[32] D. Graham and R. C. Lathrop,</w:t>
       </w:r>
       <w:r>
         <w:rPr>
@@ -22640,7 +22846,7 @@
         </w:rPr>
         <w:t xml:space="preserve"> </w:t>
       </w:r>
-      <w:hyperlink r:id="rId71">
+      <w:hyperlink r:id="rId72">
         <w:r>
           <w:rPr>
             <w:rStyle w:val="Hyperlink"/>
@@ -22665,7 +22871,7 @@
           <w:color w:val="000000"/>
           <w:sz w:val="16"/>
         </w:rPr>
-        <w:t>[32]</w:t>
+        <w:t>[33]</w:t>
       </w:r>
       <w:r>
         <w:rPr>
@@ -22731,7 +22937,7 @@
         </w:rPr>
         <w:t xml:space="preserve"> </w:t>
       </w:r>
-      <w:hyperlink r:id="rId72">
+      <w:hyperlink r:id="rId73">
         <w:r>
           <w:rPr>
             <w:rStyle w:val="Hyperlink"/>
@@ -22764,7 +22970,7 @@
           <w:color w:val="000000"/>
           <w:sz w:val="16"/>
         </w:rPr>
-        <w:t>[33] T. S. Tullis,</w:t>
+        <w:t>[34] T. S. Tullis,</w:t>
       </w:r>
       <w:r>
         <w:rPr>
@@ -22816,7 +23022,7 @@
         </w:rPr>
         <w:t xml:space="preserve"> </w:t>
       </w:r>
-      <w:hyperlink r:id="rId73">
+      <w:hyperlink r:id="rId74">
         <w:r>
           <w:rPr>
             <w:rStyle w:val="Hyperlink"/>
@@ -22841,7 +23047,7 @@
           <w:color w:val="000000"/>
           <w:sz w:val="16"/>
         </w:rPr>
-        <w:t>[34] J. I. Kiger,</w:t>
+        <w:t>[35] J. I. Kiger,</w:t>
       </w:r>
       <w:r>
         <w:rPr>
@@ -22893,7 +23099,7 @@
         </w:rPr>
         <w:t xml:space="preserve"> </w:t>
       </w:r>
-      <w:hyperlink r:id="rId74">
+      <w:hyperlink r:id="rId75">
         <w:r>
           <w:rPr>
             <w:rStyle w:val="Hyperlink"/>
@@ -22918,7 +23124,7 @@
           <w:color w:val="000000"/>
           <w:sz w:val="16"/>
         </w:rPr>
-        <w:t>[35] R. M. Dawes,</w:t>
+        <w:t>[36] R. M. Dawes,</w:t>
       </w:r>
       <w:r>
         <w:rPr>
@@ -22970,7 +23176,7 @@
         </w:rPr>
         <w:t xml:space="preserve"> </w:t>
       </w:r>
-      <w:hyperlink r:id="rId75">
+      <w:hyperlink r:id="rId76">
         <w:r>
           <w:rPr>
             <w:rStyle w:val="Hyperlink"/>
@@ -22995,7 +23201,7 @@
           <w:color w:val="000000"/>
           <w:sz w:val="16"/>
         </w:rPr>
-        <w:t>[36] K. VanLehn, S. Ohlsson, and R. Nason,</w:t>
+        <w:t>[37] K. VanLehn, S. Ohlsson, and R. Nason,</w:t>
       </w:r>
       <w:r>
         <w:rPr>
@@ -23053,7 +23259,7 @@
           <w:color w:val="000000"/>
           <w:sz w:val="16"/>
         </w:rPr>
-        <w:t>[37] T. K</w:t>
+        <w:t>[38] T. K</w:t>
       </w:r>
       <w:r>
         <w:rPr>
@@ -23145,7 +23351,7 @@
         </w:rPr>
         <w:t xml:space="preserve"> </w:t>
       </w:r>
-      <w:hyperlink r:id="rId76">
+      <w:hyperlink r:id="rId77">
         <w:r>
           <w:rPr>
             <w:rStyle w:val="Hyperlink"/>
@@ -23170,7 +23376,7 @@
           <w:color w:val="000000"/>
           <w:sz w:val="16"/>
         </w:rPr>
-        <w:t>[38] S. E. Fancsali, T. Nixon, and S. Ritter,</w:t>
+        <w:t>[39] S. E. Fancsali, T. Nixon, and S. Ritter,</w:t>
       </w:r>
       <w:r>
         <w:rPr>
@@ -23254,83 +23460,6 @@
         </w:rPr>
         <w:t xml:space="preserve">, 2013.</w:t>
       </w:r>
-    </w:p>
-    <w:p>
-      <w:pPr>
-        <w:pStyle w:val="BodyText"/>
-        <w:spacing w:before="0" w:after="0" w:line="180" w:lineRule="exact"/>
-        <w:ind w:hanging="360" w:left="360"/>
-        <w:jc w:val="left"/>
-      </w:pPr>
-      <w:r>
-        <w:rPr>
-          <w:rFonts w:ascii="Times New Roman" w:hAnsi="Times New Roman" w:cs="Times New Roman" w:eastAsia="Times New Roman"/>
-          <w:color w:val="000000"/>
-          <w:sz w:val="16"/>
-        </w:rPr>
-        <w:t>[39] H. Levitt,</w:t>
-      </w:r>
-      <w:r>
-        <w:rPr>
-          <w:rFonts w:ascii="Times New Roman" w:hAnsi="Times New Roman" w:cs="Times New Roman" w:eastAsia="Times New Roman"/>
-          <w:color w:val="000000"/>
-          <w:sz w:val="16"/>
-        </w:rPr>
-        <w:t xml:space="preserve"> </w:t>
-      </w:r>
-      <w:r>
-        <w:rPr>
-          <w:rFonts w:ascii="Times New Roman" w:hAnsi="Times New Roman" w:cs="Times New Roman" w:eastAsia="Times New Roman"/>
-          <w:color w:val="000000"/>
-          <w:sz w:val="16"/>
-        </w:rPr>
-        <w:t xml:space="preserve">“Transformed up-down methods in psychoacoustics,”</w:t>
-      </w:r>
-      <w:r>
-        <w:rPr>
-          <w:rFonts w:ascii="Times New Roman" w:hAnsi="Times New Roman" w:cs="Times New Roman" w:eastAsia="Times New Roman"/>
-          <w:color w:val="000000"/>
-          <w:sz w:val="16"/>
-        </w:rPr>
-        <w:t xml:space="preserve"> </w:t>
-      </w:r>
-      <w:r>
-        <w:rPr>
-          <w:rFonts w:ascii="Times New Roman" w:hAnsi="Times New Roman" w:cs="Times New Roman" w:eastAsia="Times New Roman"/>
-          <w:i/>
-          <w:iCs/>
-          <w:color w:val="000000"/>
-          <w:sz w:val="16"/>
-        </w:rPr>
-        <w:t xml:space="preserve">The Journal of the Acoustical Society of America</w:t>
-      </w:r>
-      <w:r>
-        <w:rPr>
-          <w:rFonts w:ascii="Times New Roman" w:hAnsi="Times New Roman" w:cs="Times New Roman" w:eastAsia="Times New Roman"/>
-          <w:color w:val="000000"/>
-          <w:sz w:val="16"/>
-        </w:rPr>
-        <w:t xml:space="preserve">, vol. 49, no. 2B, pp. 467–477, 1971. [Online]. Available:</w:t>
-      </w:r>
-      <w:r>
-        <w:rPr>
-          <w:rFonts w:ascii="Times New Roman" w:hAnsi="Times New Roman" w:cs="Times New Roman" w:eastAsia="Times New Roman"/>
-          <w:color w:val="000000"/>
-          <w:sz w:val="16"/>
-        </w:rPr>
-        <w:t xml:space="preserve"> </w:t>
-      </w:r>
-      <w:hyperlink r:id="rId77">
-        <w:r>
-          <w:rPr>
-            <w:rStyle w:val="Hyperlink"/>
-            <w:rFonts w:ascii="Times New Roman" w:hAnsi="Times New Roman" w:cs="Times New Roman" w:eastAsia="Times New Roman"/>
-            <w:color w:val="000000"/>
-            <w:sz w:val="16"/>
-          </w:rPr>
-          <w:t xml:space="preserve">https://doi.org/10.1121/1.1912375</w:t>
-        </w:r>
-      </w:hyperlink>
     </w:p>
     <w:p>
       <w:pPr>

</xml_diff>

<commit_message>
Address second review: XAOS comparison, BKT and CUSUM rationale, single-domain limitation
</commit_message>
<xml_diff>
--- a/paper/closed-loop-genui.docx
+++ b/paper/closed-loop-genui.docx
@@ -1017,7 +1017,7 @@
           <w:rFonts w:ascii="Times New Roman" w:hAnsi="Times New Roman" w:cs="Times New Roman" w:eastAsia="Times New Roman"/>
           <w:color w:val="000000"/>
         </w:rPr>
-        <w:t xml:space="preserve">and two remedies, with sensitivity to controller, metric and BKT parameters.</w:t>
+        <w:t xml:space="preserve">and two remedies, with sensitivity analyses.</w:t>
       </w:r>
     </w:p>
     <w:bookmarkEnd w:id="9"/>
@@ -1161,7 +1161,21 @@
           <w:rFonts w:ascii="Times New Roman" w:hAnsi="Times New Roman" w:cs="Times New Roman" w:eastAsia="Times New Roman"/>
           <w:color w:val="000000"/>
         </w:rPr>
-        <w:t xml:space="preserve">is a probability that can serve directly as a control variable.</w:t>
+        <w:t xml:space="preserve">is a probability that can serve directly as a control variable with interpretable</w:t>
+      </w:r>
+      <w:r>
+        <w:rPr>
+          <w:rFonts w:ascii="Times New Roman" w:hAnsi="Times New Roman" w:cs="Times New Roman" w:eastAsia="Times New Roman"/>
+          <w:color w:val="000000"/>
+        </w:rPr>
+        <w:t xml:space="preserve"> </w:t>
+      </w:r>
+      <w:r>
+        <w:rPr>
+          <w:rFonts w:ascii="Times New Roman" w:hAnsi="Times New Roman" w:cs="Times New Roman" w:eastAsia="Times New Roman"/>
+          <w:color w:val="000000"/>
+        </w:rPr>
+        <w:t xml:space="preserve">parameters.</w:t>
       </w:r>
     </w:p>
     <w:p>
@@ -11424,7 +11438,21 @@
           <w:rFonts w:ascii="Times New Roman" w:hAnsi="Times New Roman" w:cs="Times New Roman" w:eastAsia="Times New Roman"/>
           <w:color w:val="000000"/>
         </w:rPr>
-        <w:t xml:space="preserve">(Section V).</w:t>
+        <w:t xml:space="preserve">(Section V). Entropy measures such as XAOS [37] score</w:t>
+      </w:r>
+      <w:r>
+        <w:rPr>
+          <w:rFonts w:ascii="Times New Roman" w:hAnsi="Times New Roman" w:cs="Times New Roman" w:eastAsia="Times New Roman"/>
+          <w:color w:val="000000"/>
+        </w:rPr>
+        <w:t xml:space="preserve"> </w:t>
+      </w:r>
+      <w:r>
+        <w:rPr>
+          <w:rFonts w:ascii="Times New Roman" w:hAnsi="Times New Roman" w:cs="Times New Roman" w:eastAsia="Times New Roman"/>
+          <w:color w:val="000000"/>
+        </w:rPr>
+        <w:t xml:space="preserve">rendered screens;</w:t>
       </w:r>
       <w:r>
         <w:rPr>
@@ -11469,21 +11497,7 @@
           <w:rFonts w:ascii="Times New Roman" w:hAnsi="Times New Roman" w:cs="Times New Roman" w:eastAsia="Times New Roman"/>
           <w:color w:val="000000"/>
         </w:rPr>
-        <w:t xml:space="preserve">is a structural proxy; it has not been</w:t>
-      </w:r>
-      <w:r>
-        <w:rPr>
-          <w:rFonts w:ascii="Times New Roman" w:hAnsi="Times New Roman" w:cs="Times New Roman" w:eastAsia="Times New Roman"/>
-          <w:color w:val="000000"/>
-        </w:rPr>
-        <w:t xml:space="preserve"> </w:t>
-      </w:r>
-      <w:r>
-        <w:rPr>
-          <w:rFonts w:ascii="Times New Roman" w:hAnsi="Times New Roman" w:cs="Times New Roman" w:eastAsia="Times New Roman"/>
-          <w:color w:val="000000"/>
-        </w:rPr>
-        <w:t xml:space="preserve">validated against measured cognitive load.</w:t>
+        <w:t xml:space="preserve">scores the tree before rendering, as the gate requires.</w:t>
       </w:r>
     </w:p>
     <w:bookmarkEnd w:id="24"/>
@@ -11545,7 +11559,7 @@
           <w:rFonts w:ascii="Times New Roman" w:hAnsi="Times New Roman" w:cs="Times New Roman" w:eastAsia="Times New Roman"/>
           <w:color w:val="000000"/>
         </w:rPr>
-        <w:t xml:space="preserve">before human studies [37], [38], and</w:t>
+        <w:t xml:space="preserve">before human studies [38], [39], and</w:t>
       </w:r>
       <w:r>
         <w:rPr>
@@ -11573,7 +11587,7 @@
           <w:rFonts w:ascii="Times New Roman" w:hAnsi="Times New Roman" w:cs="Times New Roman" w:eastAsia="Times New Roman"/>
           <w:color w:val="000000"/>
         </w:rPr>
-        <w:t xml:space="preserve">[39]. Each learner is a two-state</w:t>
+        <w:t xml:space="preserve">[40]. Each learner is a two-state</w:t>
       </w:r>
       <w:r>
         <w:rPr>
@@ -17349,7 +17363,7 @@
           <w:rFonts w:ascii="Times New Roman" w:hAnsi="Times New Roman" w:cs="Times New Roman" w:eastAsia="Times New Roman"/>
           <w:color w:val="000000"/>
         </w:rPr>
-        <w:t xml:space="preserve">fallback catalog. Compliance thus belongs to governor, planner and gate together. The closed loop’s jitter (0.035) is 3.5 times lower than that of</w:t>
+        <w:t xml:space="preserve">fallback catalog. The closed loop’s jitter (0.035) is 3.5 times lower than that of</w:t>
       </w:r>
       <w:r>
         <w:rPr>
@@ -17561,21 +17575,7 @@
           <w:rFonts w:ascii="Times New Roman" w:hAnsi="Times New Roman" w:cs="Times New Roman" w:eastAsia="Times New Roman"/>
           <w:color w:val="000000"/>
         </w:rPr>
-        <w:t xml:space="preserve">streak grows from 5 to 14 items. In a scripted probe the unclamped integral</w:t>
-      </w:r>
-      <w:r>
-        <w:rPr>
-          <w:rFonts w:ascii="Times New Roman" w:hAnsi="Times New Roman" w:cs="Times New Roman" w:eastAsia="Times New Roman"/>
-          <w:color w:val="000000"/>
-        </w:rPr>
-        <w:t xml:space="preserve"> </w:t>
-      </w:r>
-      <w:r>
-        <w:rPr>
-          <w:rFonts w:ascii="Times New Roman" w:hAnsi="Times New Roman" w:cs="Times New Roman" w:eastAsia="Times New Roman"/>
-          <w:color w:val="000000"/>
-        </w:rPr>
-        <w:t xml:space="preserve">reached 22.9 (clamp 1.25). A one-level slew limit removes nearly all skips (0.02 per</w:t>
+        <w:t xml:space="preserve">streak grows from 5 to 14 items. A one-level slew limit removes nearly all skips (0.02 per</w:t>
       </w:r>
       <w:r>
         <w:rPr>
@@ -18740,7 +18740,7 @@
           <w:rFonts w:ascii="Times New Roman" w:hAnsi="Times New Roman" w:cs="Times New Roman" w:eastAsia="Times New Roman"/>
           <w:color w:val="000000"/>
         </w:rPr>
-        <w:t xml:space="preserve">and a CUSUM detector [40] on the</w:t>
+        <w:t xml:space="preserve">and a CUSUM detector [41] on the</w:t>
       </w:r>
       <w:r>
         <w:rPr>
@@ -18867,7 +18867,7 @@
           <w:rFonts w:ascii="Times New Roman" w:hAnsi="Times New Roman" w:cs="Times New Roman" w:eastAsia="Times New Roman"/>
           <w:color w:val="000000"/>
         </w:rPr>
-        <w:t xml:space="preserve">slips are absorbed. Forgetting uses</w:t>
+        <w:t xml:space="preserve">slips are absorbed; unlike neural forgetting models, it needs no training data. Forgetting uses</w:t>
       </w:r>
       <w:r>
         <w:rPr>
@@ -19232,7 +19232,7 @@
           <w:rFonts w:ascii="Times New Roman" w:hAnsi="Times New Roman" w:cs="Times New Roman" w:eastAsia="Times New Roman"/>
           <w:color w:val="000000"/>
         </w:rPr>
-        <w:t xml:space="preserve">[41] is left for future work.</w:t>
+        <w:t xml:space="preserve">[42] is left for future work.</w:t>
       </w:r>
     </w:p>
     <w:bookmarkEnd w:id="37"/>
@@ -19378,7 +19378,7 @@
           <w:rFonts w:ascii="Times New Roman" w:hAnsi="Times New Roman" w:cs="Times New Roman" w:eastAsia="Times New Roman"/>
           <w:color w:val="000000"/>
         </w:rPr>
-        <w:t xml:space="preserve">exist [42]; the results show structural complexity</w:t>
+        <w:t xml:space="preserve">exist [43]; the results show structural complexity</w:t>
       </w:r>
       <w:r>
         <w:rPr>
@@ -19406,60 +19406,7 @@
           <w:rFonts w:ascii="Times New Roman" w:hAnsi="Times New Roman" w:cs="Times New Roman" w:eastAsia="Times New Roman"/>
           <w:color w:val="000000"/>
         </w:rPr>
-        <w:t xml:space="preserve">parameters are design values rather than fits to tutor data;</w:t>
-      </w:r>
-      <w:r>
-        <w:rPr>
-          <w:rFonts w:ascii="Times New Roman" w:hAnsi="Times New Roman" w:cs="Times New Roman" w:eastAsia="Times New Roman"/>
-          <w:color w:val="000000"/>
-        </w:rPr>
-        <w:t xml:space="preserve"> </w:t>
-      </w:r>
-      <m:oMath>
-        <m:r>
-          <m:rPr>
-            <m:sty m:val="p"/>
-          </m:rPr>
-          <w:rPr>
-            <w:rFonts w:ascii="Cambria Math" w:hAnsi="Cambria Math"/>
-            <w:sz w:val="20"/>
-            <w:szCs w:val="20"/>
-          </w:rPr>
-          <m:t>±</m:t>
-        </m:r>
-        <m:r>
-          <w:rPr>
-            <w:rFonts w:ascii="Cambria Math" w:hAnsi="Cambria Math"/>
-            <w:sz w:val="20"/>
-            <w:szCs w:val="20"/>
-          </w:rPr>
-          <m:t>50</m:t>
-        </m:r>
-        <m:r>
-          <m:rPr>
-            <m:sty m:val="p"/>
-          </m:rPr>
-          <w:rPr>
-            <w:rFonts w:ascii="Cambria Math" w:hAnsi="Cambria Math"/>
-            <w:sz w:val="20"/>
-            <w:szCs w:val="20"/>
-          </w:rPr>
-          <m:t>%</m:t>
-        </m:r>
-      </m:oMath>
-      <w:r>
-        <w:rPr>
-          <w:rFonts w:ascii="Times New Roman" w:hAnsi="Times New Roman" w:cs="Times New Roman" w:eastAsia="Times New Roman"/>
-          <w:color w:val="000000"/>
-        </w:rPr>
-        <w:t xml:space="preserve"> </w:t>
-      </w:r>
-      <w:r>
-        <w:rPr>
-          <w:rFonts w:ascii="Times New Roman" w:hAnsi="Times New Roman" w:cs="Times New Roman" w:eastAsia="Times New Roman"/>
-          <w:color w:val="000000"/>
-        </w:rPr>
-        <w:t xml:space="preserve">changes leave tracking intact but shift when the interface escalates. Long error</w:t>
+        <w:t xml:space="preserve">parameters are design values rather than fits to tutor data. Long error</w:t>
       </w:r>
       <w:r>
         <w:rPr>
@@ -19501,35 +19448,21 @@
           <w:rFonts w:ascii="Times New Roman" w:hAnsi="Times New Roman" w:cs="Times New Roman" w:eastAsia="Times New Roman"/>
           <w:color w:val="000000"/>
         </w:rPr>
-        <w:t xml:space="preserve">The surrogate plant’s fault rates match or exceed the real model’s, but</w:t>
-      </w:r>
-      <w:r>
-        <w:rPr>
-          <w:rFonts w:ascii="Times New Roman" w:hAnsi="Times New Roman" w:cs="Times New Roman" w:eastAsia="Times New Roman"/>
-          <w:color w:val="000000"/>
-        </w:rPr>
-        <w:t xml:space="preserve"> </w:t>
-      </w:r>
-      <w:r>
-        <w:rPr>
-          <w:rFonts w:ascii="Times New Roman" w:hAnsi="Times New Roman" w:cs="Times New Roman" w:eastAsia="Times New Roman"/>
-          <w:color w:val="000000"/>
-        </w:rPr>
-        <w:t xml:space="preserve">the real model was measured on single calls, not full trajectories. Its latency (median 7.7 s free,</w:t>
-      </w:r>
-      <w:r>
-        <w:rPr>
-          <w:rFonts w:ascii="Times New Roman" w:hAnsi="Times New Roman" w:cs="Times New Roman" w:eastAsia="Times New Roman"/>
-          <w:color w:val="000000"/>
-        </w:rPr>
-        <w:t xml:space="preserve"> </w:t>
-      </w:r>
-      <w:r>
-        <w:rPr>
-          <w:rFonts w:ascii="Times New Roman" w:hAnsi="Times New Roman" w:cs="Times New Roman" w:eastAsia="Times New Roman"/>
-          <w:color w:val="000000"/>
-        </w:rPr>
-        <w:t xml:space="preserve">2.7 s guided) calls for prefetching or caching.</w:t>
+        <w:t xml:space="preserve">The real model was measured on single calls, not full trajectories. Its latency (median 7.7 s free,</w:t>
+      </w:r>
+      <w:r>
+        <w:rPr>
+          <w:rFonts w:ascii="Times New Roman" w:hAnsi="Times New Roman" w:cs="Times New Roman" w:eastAsia="Times New Roman"/>
+          <w:color w:val="000000"/>
+        </w:rPr>
+        <w:t xml:space="preserve"> </w:t>
+      </w:r>
+      <w:r>
+        <w:rPr>
+          <w:rFonts w:ascii="Times New Roman" w:hAnsi="Times New Roman" w:cs="Times New Roman" w:eastAsia="Times New Roman"/>
+          <w:color w:val="000000"/>
+        </w:rPr>
+        <w:t xml:space="preserve">2.7 s guided) calls for prefetching or caching. We tested one domain, linear equations.</w:t>
       </w:r>
     </w:p>
     <w:bookmarkEnd w:id="39"/>
@@ -19671,35 +19604,21 @@
           <w:rFonts w:ascii="Times New Roman" w:hAnsi="Times New Roman" w:cs="Times New Roman" w:eastAsia="Times New Roman"/>
           <w:color w:val="000000"/>
         </w:rPr>
-        <w:t xml:space="preserve">raw outputs met the budget with the planner and 92% without it. The next steps are</w:t>
-      </w:r>
-      <w:r>
-        <w:rPr>
-          <w:rFonts w:ascii="Times New Roman" w:hAnsi="Times New Roman" w:cs="Times New Roman" w:eastAsia="Times New Roman"/>
-          <w:color w:val="000000"/>
-        </w:rPr>
-        <w:t xml:space="preserve"> </w:t>
-      </w:r>
-      <w:r>
-        <w:rPr>
-          <w:rFonts w:ascii="Times New Roman" w:hAnsi="Times New Roman" w:cs="Times New Roman" w:eastAsia="Times New Roman"/>
-          <w:color w:val="000000"/>
-        </w:rPr>
-        <w:t xml:space="preserve">running full trajectories with the real model, a learned fast policy</w:t>
-      </w:r>
-      <w:r>
-        <w:rPr>
-          <w:rFonts w:ascii="Times New Roman" w:hAnsi="Times New Roman" w:cs="Times New Roman" w:eastAsia="Times New Roman"/>
-          <w:color w:val="000000"/>
-        </w:rPr>
-        <w:t xml:space="preserve"> </w:t>
-      </w:r>
-      <w:r>
-        <w:rPr>
-          <w:rFonts w:ascii="Times New Roman" w:hAnsi="Times New Roman" w:cs="Times New Roman" w:eastAsia="Times New Roman"/>
-          <w:color w:val="000000"/>
-        </w:rPr>
-        <w:t xml:space="preserve">trained on real interaction data, and a study with learners. We claim</w:t>
+        <w:t xml:space="preserve">raw outputs met the budget with the planner and 92% without it. Next steps are full</w:t>
+      </w:r>
+      <w:r>
+        <w:rPr>
+          <w:rFonts w:ascii="Times New Roman" w:hAnsi="Times New Roman" w:cs="Times New Roman" w:eastAsia="Times New Roman"/>
+          <w:color w:val="000000"/>
+        </w:rPr>
+        <w:t xml:space="preserve"> </w:t>
+      </w:r>
+      <w:r>
+        <w:rPr>
+          <w:rFonts w:ascii="Times New Roman" w:hAnsi="Times New Roman" w:cs="Times New Roman" w:eastAsia="Times New Roman"/>
+          <w:color w:val="000000"/>
+        </w:rPr>
+        <w:t xml:space="preserve">real-model trajectories, a learned fast policy and a study with learners. We claim</w:t>
       </w:r>
       <w:r>
         <w:rPr>
@@ -19797,7 +19716,7 @@
       </w:r>
     </w:p>
     <w:bookmarkEnd w:id="42"/>
-    <w:bookmarkStart w:id="81" w:name="references"/>
+    <w:bookmarkStart w:id="82" w:name="references"/>
     <w:p>
       <w:pPr>
         <w:pStyle w:val="Heading1"/>
@@ -23201,23 +23120,71 @@
           <w:color w:val="000000"/>
           <w:sz w:val="16"/>
         </w:rPr>
-        <w:t>[37] K. VanLehn, S. Ohlsson, and R. Nason,</w:t>
-      </w:r>
-      <w:r>
-        <w:rPr>
-          <w:rFonts w:ascii="Times New Roman" w:hAnsi="Times New Roman" w:cs="Times New Roman" w:eastAsia="Times New Roman"/>
-          <w:color w:val="000000"/>
-          <w:sz w:val="16"/>
-        </w:rPr>
-        <w:t xml:space="preserve"> </w:t>
-      </w:r>
-      <w:r>
-        <w:rPr>
-          <w:rFonts w:ascii="Times New Roman" w:hAnsi="Times New Roman" w:cs="Times New Roman" w:eastAsia="Times New Roman"/>
-          <w:color w:val="000000"/>
-          <w:sz w:val="16"/>
-        </w:rPr>
-        <w:t xml:space="preserve">“Applications of simulated students: An exploration,”</w:t>
+        <w:t>[37] C. Stickel, M. Ebner, and A. Holzinger,</w:t>
+      </w:r>
+      <w:r>
+        <w:rPr>
+          <w:rFonts w:ascii="Times New Roman" w:hAnsi="Times New Roman" w:cs="Times New Roman" w:eastAsia="Times New Roman"/>
+          <w:color w:val="000000"/>
+          <w:sz w:val="16"/>
+        </w:rPr>
+        <w:t xml:space="preserve"> </w:t>
+      </w:r>
+      <w:r>
+        <w:rPr>
+          <w:rFonts w:ascii="Times New Roman" w:hAnsi="Times New Roman" w:cs="Times New Roman" w:eastAsia="Times New Roman"/>
+          <w:color w:val="000000"/>
+          <w:sz w:val="16"/>
+        </w:rPr>
+        <w:t xml:space="preserve">“The</w:t>
+      </w:r>
+      <w:r>
+        <w:rPr>
+          <w:rFonts w:ascii="Times New Roman" w:hAnsi="Times New Roman" w:cs="Times New Roman" w:eastAsia="Times New Roman"/>
+          <w:color w:val="000000"/>
+          <w:sz w:val="16"/>
+        </w:rPr>
+        <w:t xml:space="preserve"> </w:t>
+      </w:r>
+      <w:r>
+        <w:rPr>
+          <w:rFonts w:ascii="Times New Roman" w:hAnsi="Times New Roman" w:cs="Times New Roman" w:eastAsia="Times New Roman"/>
+          <w:color w:val="000000"/>
+          <w:sz w:val="16"/>
+        </w:rPr>
+        <w:t xml:space="preserve">XAOS</w:t>
+      </w:r>
+      <w:r>
+        <w:rPr>
+          <w:rFonts w:ascii="Times New Roman" w:hAnsi="Times New Roman" w:cs="Times New Roman" w:eastAsia="Times New Roman"/>
+          <w:color w:val="000000"/>
+          <w:sz w:val="16"/>
+        </w:rPr>
+        <w:t xml:space="preserve"> </w:t>
+      </w:r>
+      <w:r>
+        <w:rPr>
+          <w:rFonts w:ascii="Times New Roman" w:hAnsi="Times New Roman" w:cs="Times New Roman" w:eastAsia="Times New Roman"/>
+          <w:color w:val="000000"/>
+          <w:sz w:val="16"/>
+        </w:rPr>
+        <w:t xml:space="preserve">metric – understanding visual complexity as measure of usability,”</w:t>
+      </w:r>
+      <w:r>
+        <w:rPr>
+          <w:rFonts w:ascii="Times New Roman" w:hAnsi="Times New Roman" w:cs="Times New Roman" w:eastAsia="Times New Roman"/>
+          <w:color w:val="000000"/>
+          <w:sz w:val="16"/>
+        </w:rPr>
+        <w:t xml:space="preserve"> </w:t>
+      </w:r>
+      <w:r>
+        <w:rPr>
+          <w:rFonts w:ascii="Times New Roman" w:hAnsi="Times New Roman" w:cs="Times New Roman" w:eastAsia="Times New Roman"/>
+          <w:color w:val="000000"/>
+          <w:sz w:val="16"/>
+        </w:rPr>
+        <w:t xml:space="preserve">in</w:t>
       </w:r>
       <w:r>
         <w:rPr>
@@ -23235,16 +23202,35 @@
           <w:color w:val="000000"/>
           <w:sz w:val="16"/>
         </w:rPr>
-        <w:t xml:space="preserve">Journal of Artificial Intelligence in Education</w:t>
-      </w:r>
-      <w:r>
-        <w:rPr>
-          <w:rFonts w:ascii="Times New Roman" w:hAnsi="Times New Roman" w:cs="Times New Roman" w:eastAsia="Times New Roman"/>
-          <w:color w:val="000000"/>
-          <w:sz w:val="16"/>
-        </w:rPr>
-        <w:t xml:space="preserve">, vol. 5, no. 2, pp. 135–175, 1994.</w:t>
-      </w:r>
+        <w:t xml:space="preserve">HCI in Work and Learning, Life and Leisure (USAB 2010)</w:t>
+      </w:r>
+      <w:r>
+        <w:rPr>
+          <w:rFonts w:ascii="Times New Roman" w:hAnsi="Times New Roman" w:cs="Times New Roman" w:eastAsia="Times New Roman"/>
+          <w:color w:val="000000"/>
+          <w:sz w:val="16"/>
+        </w:rPr>
+        <w:t xml:space="preserve">, ser. Lecture Notes in Computer Science, vol. 6389. Springer, 2010, pp. 278–290. [Online]. Available:</w:t>
+      </w:r>
+      <w:r>
+        <w:rPr>
+          <w:rFonts w:ascii="Times New Roman" w:hAnsi="Times New Roman" w:cs="Times New Roman" w:eastAsia="Times New Roman"/>
+          <w:color w:val="000000"/>
+          <w:sz w:val="16"/>
+        </w:rPr>
+        <w:t xml:space="preserve"> </w:t>
+      </w:r>
+      <w:hyperlink r:id="rId77">
+        <w:r>
+          <w:rPr>
+            <w:rStyle w:val="Hyperlink"/>
+            <w:rFonts w:ascii="Times New Roman" w:hAnsi="Times New Roman" w:cs="Times New Roman" w:eastAsia="Times New Roman"/>
+            <w:color w:val="000000"/>
+            <w:sz w:val="16"/>
+          </w:rPr>
+          <w:t xml:space="preserve">https://doi.org/10.1007/978-3-642-16607-5_18</w:t>
+        </w:r>
+      </w:hyperlink>
     </w:p>
     <w:p>
       <w:pPr>
@@ -23259,63 +23245,23 @@
           <w:color w:val="000000"/>
           <w:sz w:val="16"/>
         </w:rPr>
-        <w:t>[38] T. K</w:t>
-      </w:r>
-      <w:r>
-        <w:rPr>
-          <w:rFonts w:ascii="Times New Roman" w:hAnsi="Times New Roman" w:cs="Times New Roman" w:eastAsia="Times New Roman"/>
-          <w:color w:val="000000"/>
-          <w:sz w:val="16"/>
-        </w:rPr>
-        <w:t xml:space="preserve">ä</w:t>
-      </w:r>
-      <w:r>
-        <w:rPr>
-          <w:rFonts w:ascii="Times New Roman" w:hAnsi="Times New Roman" w:cs="Times New Roman" w:eastAsia="Times New Roman"/>
-          <w:color w:val="000000"/>
-          <w:sz w:val="16"/>
-        </w:rPr>
-        <w:t xml:space="preserve">ser and G. Alexandron,</w:t>
-      </w:r>
-      <w:r>
-        <w:rPr>
-          <w:rFonts w:ascii="Times New Roman" w:hAnsi="Times New Roman" w:cs="Times New Roman" w:eastAsia="Times New Roman"/>
-          <w:color w:val="000000"/>
-          <w:sz w:val="16"/>
-        </w:rPr>
-        <w:t xml:space="preserve"> </w:t>
-      </w:r>
-      <w:r>
-        <w:rPr>
-          <w:rFonts w:ascii="Times New Roman" w:hAnsi="Times New Roman" w:cs="Times New Roman" w:eastAsia="Times New Roman"/>
-          <w:color w:val="000000"/>
-          <w:sz w:val="16"/>
-        </w:rPr>
-        <w:t xml:space="preserve">“Simulated learners in educational technology: A systematic literature review and a</w:t>
-      </w:r>
-      <w:r>
-        <w:rPr>
-          <w:rFonts w:ascii="Times New Roman" w:hAnsi="Times New Roman" w:cs="Times New Roman" w:eastAsia="Times New Roman"/>
-          <w:color w:val="000000"/>
-          <w:sz w:val="16"/>
-        </w:rPr>
-        <w:t xml:space="preserve"> </w:t>
-      </w:r>
-      <w:r>
-        <w:rPr>
-          <w:rFonts w:ascii="Times New Roman" w:hAnsi="Times New Roman" w:cs="Times New Roman" w:eastAsia="Times New Roman"/>
-          <w:color w:val="000000"/>
-          <w:sz w:val="16"/>
-        </w:rPr>
-        <w:t xml:space="preserve">T</w:t>
-      </w:r>
-      <w:r>
-        <w:rPr>
-          <w:rFonts w:ascii="Times New Roman" w:hAnsi="Times New Roman" w:cs="Times New Roman" w:eastAsia="Times New Roman"/>
-          <w:color w:val="000000"/>
-          <w:sz w:val="16"/>
-        </w:rPr>
-        <w:t xml:space="preserve">uring-like test,”</w:t>
+        <w:t>[38] K. VanLehn, S. Ohlsson, and R. Nason,</w:t>
+      </w:r>
+      <w:r>
+        <w:rPr>
+          <w:rFonts w:ascii="Times New Roman" w:hAnsi="Times New Roman" w:cs="Times New Roman" w:eastAsia="Times New Roman"/>
+          <w:color w:val="000000"/>
+          <w:sz w:val="16"/>
+        </w:rPr>
+        <w:t xml:space="preserve"> </w:t>
+      </w:r>
+      <w:r>
+        <w:rPr>
+          <w:rFonts w:ascii="Times New Roman" w:hAnsi="Times New Roman" w:cs="Times New Roman" w:eastAsia="Times New Roman"/>
+          <w:color w:val="000000"/>
+          <w:sz w:val="16"/>
+        </w:rPr>
+        <w:t xml:space="preserve">“Applications of simulated students: An exploration,”</w:t>
       </w:r>
       <w:r>
         <w:rPr>
@@ -23333,6 +23279,104 @@
           <w:color w:val="000000"/>
           <w:sz w:val="16"/>
         </w:rPr>
+        <w:t xml:space="preserve">Journal of Artificial Intelligence in Education</w:t>
+      </w:r>
+      <w:r>
+        <w:rPr>
+          <w:rFonts w:ascii="Times New Roman" w:hAnsi="Times New Roman" w:cs="Times New Roman" w:eastAsia="Times New Roman"/>
+          <w:color w:val="000000"/>
+          <w:sz w:val="16"/>
+        </w:rPr>
+        <w:t xml:space="preserve">, vol. 5, no. 2, pp. 135–175, 1994.</w:t>
+      </w:r>
+    </w:p>
+    <w:p>
+      <w:pPr>
+        <w:pStyle w:val="BodyText"/>
+        <w:spacing w:before="0" w:after="0" w:line="180" w:lineRule="exact"/>
+        <w:ind w:hanging="360" w:left="360"/>
+        <w:jc w:val="left"/>
+      </w:pPr>
+      <w:r>
+        <w:rPr>
+          <w:rFonts w:ascii="Times New Roman" w:hAnsi="Times New Roman" w:cs="Times New Roman" w:eastAsia="Times New Roman"/>
+          <w:color w:val="000000"/>
+          <w:sz w:val="16"/>
+        </w:rPr>
+        <w:t>[39] T. K</w:t>
+      </w:r>
+      <w:r>
+        <w:rPr>
+          <w:rFonts w:ascii="Times New Roman" w:hAnsi="Times New Roman" w:cs="Times New Roman" w:eastAsia="Times New Roman"/>
+          <w:color w:val="000000"/>
+          <w:sz w:val="16"/>
+        </w:rPr>
+        <w:t xml:space="preserve">ä</w:t>
+      </w:r>
+      <w:r>
+        <w:rPr>
+          <w:rFonts w:ascii="Times New Roman" w:hAnsi="Times New Roman" w:cs="Times New Roman" w:eastAsia="Times New Roman"/>
+          <w:color w:val="000000"/>
+          <w:sz w:val="16"/>
+        </w:rPr>
+        <w:t xml:space="preserve">ser and G. Alexandron,</w:t>
+      </w:r>
+      <w:r>
+        <w:rPr>
+          <w:rFonts w:ascii="Times New Roman" w:hAnsi="Times New Roman" w:cs="Times New Roman" w:eastAsia="Times New Roman"/>
+          <w:color w:val="000000"/>
+          <w:sz w:val="16"/>
+        </w:rPr>
+        <w:t xml:space="preserve"> </w:t>
+      </w:r>
+      <w:r>
+        <w:rPr>
+          <w:rFonts w:ascii="Times New Roman" w:hAnsi="Times New Roman" w:cs="Times New Roman" w:eastAsia="Times New Roman"/>
+          <w:color w:val="000000"/>
+          <w:sz w:val="16"/>
+        </w:rPr>
+        <w:t xml:space="preserve">“Simulated learners in educational technology: A systematic literature review and a</w:t>
+      </w:r>
+      <w:r>
+        <w:rPr>
+          <w:rFonts w:ascii="Times New Roman" w:hAnsi="Times New Roman" w:cs="Times New Roman" w:eastAsia="Times New Roman"/>
+          <w:color w:val="000000"/>
+          <w:sz w:val="16"/>
+        </w:rPr>
+        <w:t xml:space="preserve"> </w:t>
+      </w:r>
+      <w:r>
+        <w:rPr>
+          <w:rFonts w:ascii="Times New Roman" w:hAnsi="Times New Roman" w:cs="Times New Roman" w:eastAsia="Times New Roman"/>
+          <w:color w:val="000000"/>
+          <w:sz w:val="16"/>
+        </w:rPr>
+        <w:t xml:space="preserve">T</w:t>
+      </w:r>
+      <w:r>
+        <w:rPr>
+          <w:rFonts w:ascii="Times New Roman" w:hAnsi="Times New Roman" w:cs="Times New Roman" w:eastAsia="Times New Roman"/>
+          <w:color w:val="000000"/>
+          <w:sz w:val="16"/>
+        </w:rPr>
+        <w:t xml:space="preserve">uring-like test,”</w:t>
+      </w:r>
+      <w:r>
+        <w:rPr>
+          <w:rFonts w:ascii="Times New Roman" w:hAnsi="Times New Roman" w:cs="Times New Roman" w:eastAsia="Times New Roman"/>
+          <w:color w:val="000000"/>
+          <w:sz w:val="16"/>
+        </w:rPr>
+        <w:t xml:space="preserve"> </w:t>
+      </w:r>
+      <w:r>
+        <w:rPr>
+          <w:rFonts w:ascii="Times New Roman" w:hAnsi="Times New Roman" w:cs="Times New Roman" w:eastAsia="Times New Roman"/>
+          <w:i/>
+          <w:iCs/>
+          <w:color w:val="000000"/>
+          <w:sz w:val="16"/>
+        </w:rPr>
         <w:t xml:space="preserve">International Journal of Artificial Intelligence in Education</w:t>
       </w:r>
       <w:r>
@@ -23351,7 +23395,7 @@
         </w:rPr>
         <w:t xml:space="preserve"> </w:t>
       </w:r>
-      <w:hyperlink r:id="rId77">
+      <w:hyperlink r:id="rId78">
         <w:r>
           <w:rPr>
             <w:rStyle w:val="Hyperlink"/>
@@ -23376,7 +23420,7 @@
           <w:color w:val="000000"/>
           <w:sz w:val="16"/>
         </w:rPr>
-        <w:t>[39] S. E. Fancsali, T. Nixon, and S. Ritter,</w:t>
+        <w:t>[40] S. E. Fancsali, T. Nixon, and S. Ritter,</w:t>
       </w:r>
       <w:r>
         <w:rPr>
@@ -23474,7 +23518,7 @@
           <w:color w:val="000000"/>
           <w:sz w:val="16"/>
         </w:rPr>
-        <w:t>[40] E. S. Page,</w:t>
+        <w:t>[41] E. S. Page,</w:t>
       </w:r>
       <w:r>
         <w:rPr>
@@ -23526,7 +23570,7 @@
         </w:rPr>
         <w:t xml:space="preserve"> </w:t>
       </w:r>
-      <w:hyperlink r:id="rId78">
+      <w:hyperlink r:id="rId79">
         <w:r>
           <w:rPr>
             <w:rStyle w:val="Hyperlink"/>
@@ -23551,7 +23595,7 @@
           <w:color w:val="000000"/>
           <w:sz w:val="16"/>
         </w:rPr>
-        <w:t>[41] A. Galyardt and I. Goldin,</w:t>
+        <w:t>[42] A. Galyardt and I. Goldin,</w:t>
       </w:r>
       <w:r>
         <w:rPr>
@@ -23603,7 +23647,7 @@
         </w:rPr>
         <w:t xml:space="preserve"> </w:t>
       </w:r>
-      <w:hyperlink r:id="rId79">
+      <w:hyperlink r:id="rId80">
         <w:r>
           <w:rPr>
             <w:rStyle w:val="Hyperlink"/>
@@ -23628,7 +23672,7 @@
           <w:color w:val="000000"/>
           <w:sz w:val="16"/>
         </w:rPr>
-        <w:t>[42] J. Leppink, F. Paas, C. P. M. Van der Vleuten, T. Van Gog, and J. J. G. Van Merri</w:t>
+        <w:t>[43] J. Leppink, F. Paas, C. P. M. Van der Vleuten, T. Van Gog, and J. J. G. Van Merri</w:t>
       </w:r>
       <w:r>
         <w:rPr>
@@ -23696,7 +23740,7 @@
         </w:rPr>
         <w:t xml:space="preserve"> </w:t>
       </w:r>
-      <w:hyperlink r:id="rId80">
+      <w:hyperlink r:id="rId81">
         <w:r>
           <w:rPr>
             <w:rStyle w:val="Hyperlink"/>
@@ -23708,7 +23752,7 @@
         </w:r>
       </w:hyperlink>
     </w:p>
-    <w:bookmarkEnd w:id="81"/>
+    <w:bookmarkEnd w:id="82"/>
     <w:sectPr>
       <w:footnotePr>
         <w:numRestart w:val="eachSect"/>

</xml_diff>